<commit_message>
Upload Tugas 2 edited
</commit_message>
<xml_diff>
--- a/Laporan Tugas 2_ PEMBUATAN AGEN AI CHATBOT WEB DENGAN TOOL DATA GOOGLE SHEETS MENGGUNAKAN N8N.docx
+++ b/Laporan Tugas 2_ PEMBUATAN AGEN AI CHATBOT WEB DENGAN TOOL DATA GOOGLE SHEETS MENGGUNAKAN N8N.docx
@@ -11,6 +11,24 @@
           <w:color w:val="auto"/>
         </w:rPr>
       </w:pPr>
+      <w:r>
+        <w:rPr>
+          <w:rFonts w:ascii="Times New Roman" w:eastAsia="Times New Roman" w:hAnsi="Times New Roman" w:cs="Times New Roman"/>
+          <w:b/>
+          <w:color w:val="auto"/>
+          <w:sz w:val="32"/>
+        </w:rPr>
+        <w:t xml:space="preserve">Tugas </w:t>
+      </w:r>
+      <w:r>
+        <w:rPr>
+          <w:rFonts w:ascii="Times New Roman" w:eastAsia="Times New Roman" w:hAnsi="Times New Roman" w:cs="Times New Roman"/>
+          <w:b/>
+          <w:color w:val="auto"/>
+          <w:sz w:val="32"/>
+        </w:rPr>
+        <w:t>2</w:t>
+      </w:r>
       <w:bookmarkStart w:id="0" w:name="_GoBack"/>
       <w:bookmarkEnd w:id="0"/>
       <w:r>
@@ -20,7 +38,7 @@
           <w:color w:val="auto"/>
           <w:sz w:val="32"/>
         </w:rPr>
-        <w:t xml:space="preserve">Tugas </w:t>
+        <w:br/>
       </w:r>
       <w:r>
         <w:rPr>
@@ -29,7 +47,7 @@
           <w:color w:val="auto"/>
           <w:sz w:val="32"/>
         </w:rPr>
-        <w:t>1</w:t>
+        <w:t>Pengembangan Agen AI tanpa Koding</w:t>
       </w:r>
       <w:r>
         <w:rPr>
@@ -38,7 +56,7 @@
           <w:color w:val="auto"/>
           <w:sz w:val="32"/>
         </w:rPr>
-        <w:br/>
+        <w:t xml:space="preserve"> </w:t>
       </w:r>
       <w:r>
         <w:rPr>
@@ -47,7 +65,7 @@
           <w:color w:val="auto"/>
           <w:sz w:val="32"/>
         </w:rPr>
-        <w:t>Pengembangan Agen AI tanpa Koding</w:t>
+        <w:t xml:space="preserve">- </w:t>
       </w:r>
       <w:r>
         <w:rPr>
@@ -56,43 +74,7 @@
           <w:color w:val="auto"/>
           <w:sz w:val="32"/>
         </w:rPr>
-        <w:t xml:space="preserve"> </w:t>
-      </w:r>
-      <w:r>
-        <w:rPr>
-          <w:rFonts w:ascii="Times New Roman" w:eastAsia="Times New Roman" w:hAnsi="Times New Roman" w:cs="Times New Roman"/>
-          <w:b/>
-          <w:color w:val="auto"/>
-          <w:sz w:val="32"/>
-        </w:rPr>
-        <w:t xml:space="preserve">- </w:t>
-      </w:r>
-      <w:r>
-        <w:rPr>
-          <w:rFonts w:ascii="Times New Roman" w:eastAsia="Times New Roman" w:hAnsi="Times New Roman" w:cs="Times New Roman"/>
-          <w:b/>
-          <w:color w:val="auto"/>
-          <w:sz w:val="32"/>
-        </w:rPr>
-        <w:t>PEMBUATAN AGEN AI CHATBOT WEB DENGAN WORKFLOW N8N.CLOUD</w:t>
-      </w:r>
-    </w:p>
-    <w:p>
-      <w:pPr>
-        <w:spacing w:after="0" w:line="276" w:lineRule="auto"/>
-        <w:rPr>
-          <w:rFonts w:ascii="Times New Roman" w:hAnsi="Times New Roman" w:cs="Times New Roman"/>
-          <w:color w:val="auto"/>
-        </w:rPr>
-      </w:pPr>
-      <w:r>
-        <w:rPr>
-          <w:rFonts w:ascii="Times New Roman" w:eastAsia="Times New Roman" w:hAnsi="Times New Roman" w:cs="Times New Roman"/>
-          <w:b/>
-          <w:color w:val="auto"/>
-          <w:sz w:val="20"/>
-        </w:rPr>
-        <w:t xml:space="preserve"> </w:t>
+        <w:t>PEMBUATAN AGEN AI CHATBOT WEB DENGAN TOOL DATA GOOGLE SHEETS MENGGUNAKAN N8N</w:t>
       </w:r>
     </w:p>
     <w:p>
@@ -639,16 +621,26 @@
     <w:p>
       <w:pPr>
         <w:pStyle w:val="Heading1"/>
-        <w:rPr>
-          <w:color w:val="auto"/>
-        </w:rPr>
-      </w:pPr>
-      <w:r>
-        <w:rPr>
-          <w:color w:val="auto"/>
-        </w:rPr>
+      </w:pPr>
+      <w:r>
         <w:lastRenderedPageBreak/>
-        <w:t>URAIAN HASIL PENGERJAAN (Langkah 1 s.d. 7)</w:t>
+        <w:t>URAIAN HASIL PENGERJAAN (LANGKAH 1 S.D. 8)</w:t>
+      </w:r>
+    </w:p>
+    <w:p>
+      <w:pPr>
+        <w:pStyle w:val="Heading4"/>
+        <w:rPr>
+          <w:rFonts w:ascii="Times New Roman" w:hAnsi="Times New Roman" w:cs="Times New Roman"/>
+          <w:color w:val="auto"/>
+        </w:rPr>
+      </w:pPr>
+      <w:r>
+        <w:rPr>
+          <w:rFonts w:ascii="Times New Roman" w:hAnsi="Times New Roman" w:cs="Times New Roman"/>
+          <w:color w:val="auto"/>
+        </w:rPr>
+        <w:t>Langkah 1: Penentuan Tugas Chatbot AI dan Penyiapan Data Google Sheets</w:t>
       </w:r>
     </w:p>
     <w:p>
@@ -656,7 +648,7 @@
         <w:pStyle w:val="NormalWeb"/>
         <w:numPr>
           <w:ilvl w:val="0"/>
-          <w:numId w:val="10"/>
+          <w:numId w:val="12"/>
         </w:numPr>
       </w:pPr>
       <w:r>
@@ -664,26 +656,60 @@
           <w:b/>
           <w:bCs/>
         </w:rPr>
-        <w:t>Penetapan Peran &amp; Tugas Chatbot (Poin 1):</w:t>
-      </w:r>
-    </w:p>
-    <w:p>
-      <w:pPr>
-        <w:pStyle w:val="NormalWeb"/>
-        <w:ind w:left="720"/>
-      </w:pPr>
-      <w:r>
-        <w:t xml:space="preserve">Chatbot AI dirancang sebagai </w:t>
+        <w:t>Tugas Chatbot</w:t>
+      </w:r>
+      <w:r>
+        <w:t xml:space="preserve">: Chatbot difungsikan sebagai </w:t>
+      </w:r>
+      <w:r>
+        <w:rPr>
+          <w:i/>
+          <w:iCs/>
+        </w:rPr>
+        <w:t>Customer Service / AI Assistant</w:t>
+      </w:r>
+      <w:r>
+        <w:t xml:space="preserve"> interaktif yang bertugas memberikan informasi mengenai </w:t>
       </w:r>
       <w:r>
         <w:rPr>
           <w:b/>
           <w:bCs/>
         </w:rPr>
-        <w:t>Asisten Layanan Pelanggan (Customer Support AI Chatbot)</w:t>
-      </w:r>
-      <w:r>
-        <w:t>. Tugas utamanya adalah memberikan informasi lengkap mengenai detail produk, harga, jam operasional toko, serta membantu menjawab pertanyaan umum pengguna terkait layanan bisnis secara otomatis dan sopan.</w:t>
+        <w:t>Program Pelatihan</w:t>
+      </w:r>
+      <w:r>
+        <w:t xml:space="preserve">, </w:t>
+      </w:r>
+      <w:r>
+        <w:rPr>
+          <w:b/>
+          <w:bCs/>
+        </w:rPr>
+        <w:t>Nama Kursus</w:t>
+      </w:r>
+      <w:r>
+        <w:t xml:space="preserve">, </w:t>
+      </w:r>
+      <w:r>
+        <w:rPr>
+          <w:b/>
+          <w:bCs/>
+        </w:rPr>
+        <w:t>Deskripsi Topik</w:t>
+      </w:r>
+      <w:r>
+        <w:t xml:space="preserve">, serta </w:t>
+      </w:r>
+      <w:r>
+        <w:rPr>
+          <w:b/>
+          <w:bCs/>
+        </w:rPr>
+        <w:t>Biaya/Harga</w:t>
+      </w:r>
+      <w:r>
+        <w:t xml:space="preserve"> dari lembaga penyedia pelatihan.</w:t>
       </w:r>
     </w:p>
     <w:p>
@@ -691,7 +717,7 @@
         <w:pStyle w:val="NormalWeb"/>
         <w:numPr>
           <w:ilvl w:val="0"/>
-          <w:numId w:val="10"/>
+          <w:numId w:val="12"/>
         </w:numPr>
       </w:pPr>
       <w:r>
@@ -699,400 +725,49 @@
           <w:b/>
           <w:bCs/>
         </w:rPr>
-        <w:t>Trigger Input Chat (Poin 2):</w:t>
-      </w:r>
-    </w:p>
-    <w:p>
-      <w:pPr>
-        <w:pStyle w:val="NormalWeb"/>
-        <w:ind w:left="720"/>
-      </w:pPr>
-      <w:r>
-        <w:t xml:space="preserve">Input percakapan mengintegrasikan node </w:t>
-      </w:r>
-      <w:r>
-        <w:rPr>
-          <w:b/>
-          <w:bCs/>
-        </w:rPr>
-        <w:t>When chat message received</w:t>
-      </w:r>
-      <w:r>
-        <w:t xml:space="preserve"> (</w:t>
+        <w:t>Sumber Data</w:t>
+      </w:r>
+      <w:r>
+        <w:t>: Menggunakan salinan Google Sheets yang memuat daftar produk pelatihan (</w:t>
       </w:r>
       <w:r>
         <w:rPr>
           <w:i/>
           <w:iCs/>
         </w:rPr>
-        <w:t>Chat Trigger</w:t>
-      </w:r>
-      <w:r>
-        <w:t>) yang berfungsi sebagai pengait (</w:t>
+        <w:t>Bootcamp</w:t>
+      </w:r>
+      <w:r>
+        <w:t xml:space="preserve"> dan </w:t>
       </w:r>
       <w:r>
         <w:rPr>
           <w:i/>
           <w:iCs/>
         </w:rPr>
-        <w:t>webhook</w:t>
-      </w:r>
-      <w:r>
-        <w:t xml:space="preserve">) untuk menerima pesan teks dari pengguna melalui antarmuka </w:t>
-      </w:r>
-      <w:r>
-        <w:rPr>
-          <w:i/>
-          <w:iCs/>
-        </w:rPr>
-        <w:t>Web Chat Window</w:t>
-      </w:r>
-      <w:r>
-        <w:t>.</w:t>
+        <w:t>Skill Up</w:t>
+      </w:r>
+      <w:r>
+        <w:t>) berserta rincian harga dan topik pembahasan.</w:t>
       </w:r>
     </w:p>
     <w:p>
       <w:pPr>
         <w:pStyle w:val="NormalWeb"/>
-        <w:numPr>
-          <w:ilvl w:val="0"/>
-          <w:numId w:val="10"/>
-        </w:numPr>
-      </w:pPr>
-      <w:r>
-        <w:rPr>
-          <w:b/>
-          <w:bCs/>
-        </w:rPr>
-        <w:t>Sub-Node Model AI Gemini (Poin 3):</w:t>
-      </w:r>
-    </w:p>
-    <w:p>
-      <w:pPr>
-        <w:pStyle w:val="NormalWeb"/>
-        <w:ind w:left="720"/>
-      </w:pPr>
-      <w:r>
-        <w:t xml:space="preserve">Node </w:t>
-      </w:r>
-      <w:r>
-        <w:rPr>
-          <w:b/>
-          <w:bCs/>
-        </w:rPr>
-        <w:t>AI Agent</w:t>
-      </w:r>
-      <w:r>
-        <w:t xml:space="preserve"> terhubung dengan sub-node model bahasa </w:t>
-      </w:r>
-      <w:r>
-        <w:rPr>
-          <w:b/>
-          <w:bCs/>
-        </w:rPr>
-        <w:t>Google Gemini Chat Model</w:t>
-      </w:r>
-      <w:r>
-        <w:t xml:space="preserve"> (</w:t>
-      </w:r>
-      <w:r>
-        <w:rPr>
-          <w:rStyle w:val="HTMLCode"/>
-          <w:rFonts w:ascii="Times New Roman" w:eastAsiaTheme="majorEastAsia" w:hAnsi="Times New Roman" w:cs="Times New Roman"/>
-        </w:rPr>
-        <w:t>models/gemini-2.5-flash-lite</w:t>
-      </w:r>
-      <w:r>
-        <w:t xml:space="preserve">) yang telah dihubungkan secara aman menggunakan </w:t>
-      </w:r>
-      <w:r>
-        <w:rPr>
-          <w:i/>
-          <w:iCs/>
-        </w:rPr>
-        <w:t>API Key</w:t>
-      </w:r>
-      <w:r>
-        <w:t xml:space="preserve"> terautentikasi dari Google AI Studio.</w:t>
-      </w:r>
-    </w:p>
-    <w:p>
-      <w:pPr>
-        <w:pStyle w:val="NormalWeb"/>
-        <w:numPr>
-          <w:ilvl w:val="0"/>
-          <w:numId w:val="10"/>
-        </w:numPr>
-      </w:pPr>
-      <w:r>
-        <w:rPr>
-          <w:b/>
-          <w:bCs/>
-        </w:rPr>
-        <w:t>Konfigurasi Chat Memory (Poin 4):</w:t>
-      </w:r>
-    </w:p>
-    <w:p>
-      <w:pPr>
-        <w:pStyle w:val="NormalWeb"/>
-        <w:ind w:left="720"/>
-      </w:pPr>
-      <w:r>
-        <w:t xml:space="preserve">Node </w:t>
-      </w:r>
-      <w:r>
-        <w:rPr>
-          <w:b/>
-          <w:bCs/>
-        </w:rPr>
-        <w:t>AI Agent</w:t>
-      </w:r>
-      <w:r>
-        <w:t xml:space="preserve"> dilengkapi dengan sub-node </w:t>
-      </w:r>
-      <w:r>
-        <w:rPr>
-          <w:b/>
-          <w:bCs/>
-        </w:rPr>
-        <w:t>Window Buffer Memory</w:t>
-      </w:r>
-      <w:r>
-        <w:t xml:space="preserve"> yang dikonfigurasi dengan </w:t>
-      </w:r>
-      <w:r>
-        <w:rPr>
-          <w:i/>
-          <w:iCs/>
-        </w:rPr>
-        <w:t>Context Window Length</w:t>
-      </w:r>
-      <w:r>
-        <w:t xml:space="preserve"> bernilai </w:t>
-      </w:r>
-      <w:r>
-        <w:rPr>
-          <w:rStyle w:val="HTMLCode"/>
-          <w:rFonts w:ascii="Times New Roman" w:eastAsiaTheme="majorEastAsia" w:hAnsi="Times New Roman" w:cs="Times New Roman"/>
-        </w:rPr>
-        <w:t>10</w:t>
-      </w:r>
-      <w:r>
-        <w:t xml:space="preserve">. Hal ini memungkinkan chatbot menyimpan konteks </w:t>
-      </w:r>
-      <w:r>
-        <w:rPr>
-          <w:b/>
-          <w:bCs/>
-        </w:rPr>
-        <w:t>5 pasang percakapan terakhir</w:t>
-      </w:r>
-      <w:r>
-        <w:t xml:space="preserve"> (5 input pengguna dan 5 respons AI) agar dialog berlangsung secara berkesinambungan.</w:t>
-      </w:r>
-    </w:p>
-    <w:p>
-      <w:pPr>
-        <w:pStyle w:val="NormalWeb"/>
-        <w:numPr>
-          <w:ilvl w:val="0"/>
-          <w:numId w:val="10"/>
-        </w:numPr>
-      </w:pPr>
-      <w:r>
-        <w:rPr>
-          <w:b/>
-          <w:bCs/>
-        </w:rPr>
-        <w:t>Instruksi System Message (Poin 5):</w:t>
-      </w:r>
-    </w:p>
-    <w:p>
-      <w:pPr>
-        <w:pStyle w:val="NormalWeb"/>
-        <w:ind w:left="720"/>
-      </w:pPr>
-      <w:r>
-        <w:t xml:space="preserve">System message pada </w:t>
-      </w:r>
-      <w:r>
-        <w:rPr>
-          <w:b/>
-          <w:bCs/>
-        </w:rPr>
-        <w:t>AI Agent</w:t>
-      </w:r>
-      <w:r>
-        <w:t xml:space="preserve"> diberikan instruksi spesifik sebagai berikut:</w:t>
-      </w:r>
-    </w:p>
-    <w:p>
-      <w:pPr>
-        <w:pStyle w:val="NormalWeb"/>
-        <w:ind w:left="720"/>
-      </w:pPr>
-      <w:r>
-        <w:rPr>
-          <w:i/>
-          <w:iCs/>
-        </w:rPr>
-        <w:t>"Anda adalah Asisten Layanan Pelanggan (Customer Support) AI yang ramah, profesional, dan solutif. Tugas utama Anda adalah memberikan informasi lengkap mengenai produk, harga, jam operasional, serta membantu memecahkan masalah dasar pengguna terkait layanan kami..."</w:t>
-      </w:r>
-    </w:p>
-    <w:p>
-      <w:pPr>
-        <w:pStyle w:val="NormalWeb"/>
-        <w:numPr>
-          <w:ilvl w:val="0"/>
-          <w:numId w:val="10"/>
-        </w:numPr>
-      </w:pPr>
-      <w:r>
-        <w:rPr>
-          <w:b/>
-          <w:bCs/>
-        </w:rPr>
-        <w:t>Pengujian pada Canvas n8n (Poin 6):</w:t>
-      </w:r>
-    </w:p>
-    <w:p>
-      <w:pPr>
-        <w:pStyle w:val="NormalWeb"/>
-        <w:ind w:left="720"/>
-      </w:pPr>
-      <w:r>
-        <w:t xml:space="preserve">Uji coba internal dilakukan melalui panel </w:t>
-      </w:r>
-      <w:r>
-        <w:rPr>
-          <w:i/>
-          <w:iCs/>
-        </w:rPr>
-        <w:t>Chat Preview</w:t>
-      </w:r>
-      <w:r>
-        <w:t xml:space="preserve"> bawaan canvas n8n. Agen AI berhasil mengeksekusi </w:t>
-      </w:r>
-      <w:r>
-        <w:rPr>
-          <w:i/>
-          <w:iCs/>
-        </w:rPr>
-        <w:t>prompt</w:t>
-      </w:r>
-      <w:r>
-        <w:t xml:space="preserve">, membaca memori percakapan, dan memberikan balasan bahasa Indonesia yang terstruktur dengan indikator </w:t>
-      </w:r>
-      <w:r>
-        <w:rPr>
-          <w:i/>
-          <w:iCs/>
-        </w:rPr>
-        <w:t>Success</w:t>
-      </w:r>
-      <w:r>
-        <w:t>.</w:t>
-      </w:r>
-    </w:p>
-    <w:p>
-      <w:pPr>
-        <w:pStyle w:val="NormalWeb"/>
-        <w:numPr>
-          <w:ilvl w:val="0"/>
-          <w:numId w:val="10"/>
-        </w:numPr>
-      </w:pPr>
-      <w:r>
-        <w:rPr>
-          <w:b/>
-          <w:bCs/>
-        </w:rPr>
-        <w:t>Aktivasi &amp; Pengujian Web Public (Poin 7):</w:t>
-      </w:r>
-    </w:p>
-    <w:p>
-      <w:pPr>
-        <w:pStyle w:val="NormalWeb"/>
-        <w:ind w:left="720"/>
-      </w:pPr>
-      <w:r>
-        <w:t xml:space="preserve">Workflow telah dialihkan statusnya menjadi </w:t>
-      </w:r>
-      <w:r>
-        <w:rPr>
-          <w:b/>
-          <w:bCs/>
-        </w:rPr>
-        <w:t>Published / Active</w:t>
-      </w:r>
-      <w:r>
-        <w:t xml:space="preserve">. Akses antarmuka obrolan diuji secara langsung melalui </w:t>
-      </w:r>
-      <w:r>
-        <w:rPr>
-          <w:i/>
-          <w:iCs/>
-        </w:rPr>
-        <w:t>Production Public Chat URL</w:t>
-      </w:r>
-      <w:r>
-        <w:t xml:space="preserve"> pada peramban (</w:t>
-      </w:r>
-      <w:r>
-        <w:rPr>
-          <w:i/>
-          <w:iCs/>
-        </w:rPr>
-        <w:t>web browser</w:t>
-      </w:r>
-      <w:r>
-        <w:t>) dan berhasil membalas pesan pengguna tanpa kendala.</w:t>
-      </w:r>
-    </w:p>
-    <w:p>
-      <w:pPr>
-        <w:pStyle w:val="Heading1"/>
-        <w:rPr>
-          <w:color w:val="auto"/>
-        </w:rPr>
-      </w:pPr>
-      <w:r>
-        <w:rPr>
-          <w:color w:val="auto"/>
-        </w:rPr>
-        <w:lastRenderedPageBreak/>
-        <w:t>BUKTI PROSES &amp; EKSEKUSI (SCREENSHOT)</w:t>
-      </w:r>
-    </w:p>
-    <w:p>
-      <w:pPr>
-        <w:pStyle w:val="Heading4"/>
-        <w:rPr>
-          <w:rFonts w:ascii="Times New Roman" w:hAnsi="Times New Roman" w:cs="Times New Roman"/>
-          <w:color w:val="auto"/>
-        </w:rPr>
-      </w:pPr>
-      <w:r>
-        <w:rPr>
-          <w:rFonts w:ascii="Times New Roman" w:hAnsi="Times New Roman" w:cs="Times New Roman"/>
-          <w:color w:val="auto"/>
-        </w:rPr>
-        <w:t>1. Bukti Konfigurasi Canvas &amp; Struktur Node Workflow</w:t>
-      </w:r>
-    </w:p>
-    <w:p>
-      <w:pPr>
-        <w:pStyle w:val="NormalWeb"/>
+        <w:spacing w:after="0" w:afterAutospacing="0"/>
         <w:jc w:val="center"/>
-      </w:pPr>
-      <w:r>
-        <w:rPr>
-          <w:noProof/>
+        <w:rPr>
+          <w:rFonts w:ascii="Segoe UI Emoji" w:hAnsi="Segoe UI Emoji" w:cs="Segoe UI Emoji"/>
+        </w:rPr>
+      </w:pPr>
+      <w:r>
+        <w:rPr>
+          <w:rFonts w:ascii="Segoe UI Emoji" w:hAnsi="Segoe UI Emoji" w:cs="Segoe UI Emoji"/>
         </w:rPr>
         <w:drawing>
-          <wp:inline distT="0" distB="0" distL="0" distR="0" wp14:anchorId="10DEB166" wp14:editId="339ECA17">
-            <wp:extent cx="3405505" cy="2562497"/>
-            <wp:effectExtent l="0" t="0" r="4445" b="9525"/>
+          <wp:inline distT="0" distB="0" distL="0" distR="0" wp14:anchorId="27B137B2" wp14:editId="136E4B25">
+            <wp:extent cx="4882836" cy="2497414"/>
+            <wp:effectExtent l="0" t="0" r="0" b="0"/>
             <wp:docPr id="1" name="Picture 1"/>
             <wp:cNvGraphicFramePr>
               <a:graphicFrameLocks xmlns:a="http://schemas.openxmlformats.org/drawingml/2006/main" noChangeAspect="1"/>
@@ -1113,7 +788,7 @@
                   <pic:spPr>
                     <a:xfrm>
                       <a:off x="0" y="0"/>
-                      <a:ext cx="3439986" cy="2588443"/>
+                      <a:ext cx="4906595" cy="2509566"/>
                     </a:xfrm>
                     <a:prstGeom prst="rect">
                       <a:avLst/>
@@ -1129,29 +804,126 @@
     <w:p>
       <w:pPr>
         <w:pStyle w:val="NormalWeb"/>
-      </w:pPr>
-      <w:r>
-        <w:t>2. Bukti Pengujian Chatbot pada Canvas n8n (Poin 6)</w:t>
-      </w:r>
-    </w:p>
-    <w:p>
-      <w:pPr>
-        <w:pStyle w:val="Heading4"/>
+        <w:spacing w:before="0" w:beforeAutospacing="0"/>
         <w:jc w:val="center"/>
         <w:rPr>
-          <w:rFonts w:ascii="Times New Roman" w:hAnsi="Times New Roman" w:cs="Times New Roman"/>
-          <w:color w:val="auto"/>
-        </w:rPr>
-      </w:pPr>
-      <w:r>
-        <w:rPr>
-          <w:noProof/>
+          <w:b/>
+          <w:bCs/>
+        </w:rPr>
+      </w:pPr>
+      <w:r>
+        <w:rPr>
+          <w:b/>
+          <w:bCs/>
+        </w:rPr>
+        <w:t>GAMBAR 1: Tampilan Google Sheets Data Produk &amp; Harga</w:t>
+      </w:r>
+    </w:p>
+    <w:p>
+      <w:pPr>
+        <w:pStyle w:val="NormalWeb"/>
+        <w:rPr>
+          <w:i/>
+          <w:iCs/>
+        </w:rPr>
+      </w:pPr>
+      <w:r>
+        <w:rPr>
+          <w:i/>
+          <w:iCs/>
+        </w:rPr>
+        <w:t>Langkah 2: Konfigurasi Trigger Input (</w:t>
+      </w:r>
+      <w:r>
+        <w:rPr>
+          <w:rStyle w:val="HTMLCode"/>
+          <w:rFonts w:ascii="Times New Roman" w:eastAsiaTheme="majorEastAsia" w:hAnsi="Times New Roman" w:cs="Times New Roman"/>
+          <w:i/>
+          <w:iCs/>
+        </w:rPr>
+        <w:t>When chat message received</w:t>
+      </w:r>
+      <w:r>
+        <w:rPr>
+          <w:i/>
+          <w:iCs/>
+        </w:rPr>
+        <w:t>)</w:t>
+      </w:r>
+    </w:p>
+    <w:p>
+      <w:pPr>
+        <w:pStyle w:val="NormalWeb"/>
+        <w:numPr>
+          <w:ilvl w:val="0"/>
+          <w:numId w:val="13"/>
+        </w:numPr>
+      </w:pPr>
+      <w:r>
+        <w:t xml:space="preserve">Dibuat node trigger bertipe </w:t>
+      </w:r>
+      <w:r>
+        <w:rPr>
+          <w:rStyle w:val="HTMLCode"/>
+          <w:rFonts w:ascii="Times New Roman" w:eastAsiaTheme="majorEastAsia" w:hAnsi="Times New Roman" w:cs="Times New Roman"/>
+        </w:rPr>
+        <w:t>@n8n/n8n-nodes-langchain.chatTrigger</w:t>
+      </w:r>
+      <w:r>
+        <w:t>.</w:t>
+      </w:r>
+    </w:p>
+    <w:p>
+      <w:pPr>
+        <w:pStyle w:val="NormalWeb"/>
+        <w:numPr>
+          <w:ilvl w:val="0"/>
+          <w:numId w:val="13"/>
+        </w:numPr>
+      </w:pPr>
+      <w:r>
+        <w:t>Dikonfigurasi agar dapat diakses secara publik (</w:t>
+      </w:r>
+      <w:r>
+        <w:rPr>
+          <w:b/>
+          <w:bCs/>
+        </w:rPr>
+        <w:t>Public Webchat</w:t>
+      </w:r>
+      <w:r>
+        <w:t xml:space="preserve">) dan diberikan judul antarmuka </w:t>
+      </w:r>
+      <w:r>
+        <w:rPr>
+          <w:i/>
+          <w:iCs/>
+        </w:rPr>
+        <w:t>"Asisten Layanan Informasi Produk &amp; Harga Pelatihan"</w:t>
+      </w:r>
+      <w:r>
+        <w:t>.</w:t>
+      </w:r>
+    </w:p>
+    <w:p>
+      <w:pPr>
+        <w:pStyle w:val="NormalWeb"/>
+        <w:jc w:val="center"/>
+        <w:rPr>
+          <w:b/>
+          <w:bCs/>
+        </w:rPr>
+      </w:pPr>
+      <w:r>
+        <w:rPr>
+          <w:b/>
+          <w:bCs/>
         </w:rPr>
         <w:drawing>
-          <wp:inline distT="0" distB="0" distL="0" distR="0" wp14:anchorId="4136DA19" wp14:editId="5C42A24D">
-            <wp:extent cx="3368675" cy="3368675"/>
-            <wp:effectExtent l="0" t="0" r="0" b="0"/>
-            <wp:docPr id="6" name="Picture 6"/>
+          <wp:inline distT="0" distB="0" distL="0" distR="0" wp14:anchorId="12751CC5" wp14:editId="285CCB32">
+            <wp:extent cx="3676267" cy="2743200"/>
+            <wp:effectExtent l="0" t="0" r="635" b="0"/>
+            <wp:docPr id="2" name="Picture 2"/>
             <wp:cNvGraphicFramePr>
               <a:graphicFrameLocks xmlns:a="http://schemas.openxmlformats.org/drawingml/2006/main" noChangeAspect="1"/>
             </wp:cNvGraphicFramePr>
@@ -1162,20 +934,27 @@
                     <pic:cNvPr id="1" name=""/>
                     <pic:cNvPicPr/>
                   </pic:nvPicPr>
-                  <pic:blipFill>
+                  <pic:blipFill rotWithShape="1">
                     <a:blip r:embed="rId8"/>
-                    <a:stretch>
-                      <a:fillRect/>
-                    </a:stretch>
+                    <a:srcRect t="3988" b="17468"/>
+                    <a:stretch/>
                   </pic:blipFill>
-                  <pic:spPr>
+                  <pic:spPr bwMode="auto">
                     <a:xfrm>
                       <a:off x="0" y="0"/>
-                      <a:ext cx="3368675" cy="3368675"/>
+                      <a:ext cx="3735985" cy="2787761"/>
                     </a:xfrm>
                     <a:prstGeom prst="rect">
                       <a:avLst/>
                     </a:prstGeom>
+                    <a:ln>
+                      <a:noFill/>
+                    </a:ln>
+                    <a:extLst>
+                      <a:ext uri="{53640926-AAD7-44D8-BBD7-CCE9431645EC}">
+                        <a14:shadowObscured xmlns:a14="http://schemas.microsoft.com/office/drawing/2010/main"/>
+                      </a:ext>
+                    </a:extLst>
                   </pic:spPr>
                 </pic:pic>
               </a:graphicData>
@@ -1184,7 +963,19 @@
         </w:drawing>
       </w:r>
     </w:p>
-    <w:p/>
+    <w:p>
+      <w:pPr>
+        <w:pStyle w:val="NormalWeb"/>
+        <w:jc w:val="center"/>
+      </w:pPr>
+      <w:r>
+        <w:rPr>
+          <w:b/>
+          <w:bCs/>
+        </w:rPr>
+        <w:t>GAMBAR 2: Konfigurasi Node Chat Trigger</w:t>
+      </w:r>
+    </w:p>
     <w:p>
       <w:pPr>
         <w:pStyle w:val="Heading4"/>
@@ -1199,26 +990,99 @@
           <w:color w:val="auto"/>
         </w:rPr>
         <w:lastRenderedPageBreak/>
-        <w:t>3. Bukti Pengujian Chatbot melalui Tautan Web Chat Browser (Poin 7)</w:t>
-      </w:r>
-    </w:p>
-    <w:p>
-      <w:pPr>
-        <w:pStyle w:val="Heading3"/>
+        <w:t>Langkah 3: Konfigurasi Sub-node AI Model (</w:t>
+      </w:r>
+      <w:r>
+        <w:rPr>
+          <w:rStyle w:val="HTMLCode"/>
+          <w:rFonts w:ascii="Times New Roman" w:eastAsiaTheme="majorEastAsia" w:hAnsi="Times New Roman" w:cs="Times New Roman"/>
+          <w:color w:val="auto"/>
+        </w:rPr>
+        <w:t>Google Gemini Chat Model</w:t>
+      </w:r>
+      <w:r>
         <w:rPr>
           <w:rFonts w:ascii="Times New Roman" w:hAnsi="Times New Roman" w:cs="Times New Roman"/>
           <w:color w:val="auto"/>
         </w:rPr>
-      </w:pPr>
-      <w:r>
-        <w:rPr>
-          <w:noProof/>
+        <w:t>)</w:t>
+      </w:r>
+    </w:p>
+    <w:p>
+      <w:pPr>
+        <w:pStyle w:val="NormalWeb"/>
+        <w:numPr>
+          <w:ilvl w:val="0"/>
+          <w:numId w:val="14"/>
+        </w:numPr>
+      </w:pPr>
+      <w:r>
+        <w:t xml:space="preserve">Menggunakan sub-node </w:t>
+      </w:r>
+      <w:r>
+        <w:rPr>
+          <w:rStyle w:val="HTMLCode"/>
+          <w:rFonts w:ascii="Times New Roman" w:eastAsiaTheme="majorEastAsia" w:hAnsi="Times New Roman" w:cs="Times New Roman"/>
+        </w:rPr>
+        <w:t>@n8n/n8n-nodes-langchain.lmChatGoogleGemini</w:t>
+      </w:r>
+      <w:r>
+        <w:t>.</w:t>
+      </w:r>
+    </w:p>
+    <w:p>
+      <w:pPr>
+        <w:pStyle w:val="NormalWeb"/>
+        <w:numPr>
+          <w:ilvl w:val="0"/>
+          <w:numId w:val="14"/>
+        </w:numPr>
+      </w:pPr>
+      <w:r>
+        <w:t xml:space="preserve">Model yang digunakan adalah </w:t>
+      </w:r>
+      <w:r>
+        <w:rPr>
+          <w:rStyle w:val="HTMLCode"/>
+          <w:rFonts w:ascii="Times New Roman" w:eastAsiaTheme="majorEastAsia" w:hAnsi="Times New Roman" w:cs="Times New Roman"/>
+        </w:rPr>
+        <w:t>models/gemini-1.5-flash</w:t>
+      </w:r>
+      <w:r>
+        <w:t>.</w:t>
+      </w:r>
+    </w:p>
+    <w:p>
+      <w:pPr>
+        <w:pStyle w:val="NormalWeb"/>
+        <w:numPr>
+          <w:ilvl w:val="0"/>
+          <w:numId w:val="14"/>
+        </w:numPr>
+      </w:pPr>
+      <w:r>
+        <w:t>Kredensial dihubungkan dengan Google Gemini API Key yang telah dibuat pada Google AI Studio.</w:t>
+      </w:r>
+    </w:p>
+    <w:p>
+      <w:pPr>
+        <w:pStyle w:val="NormalWeb"/>
+        <w:jc w:val="center"/>
+        <w:rPr>
+          <w:b/>
+          <w:bCs/>
+        </w:rPr>
+      </w:pPr>
+      <w:r>
+        <w:rPr>
+          <w:b/>
+          <w:bCs/>
         </w:rPr>
         <w:drawing>
-          <wp:inline distT="0" distB="0" distL="0" distR="0" wp14:anchorId="31FEECCE" wp14:editId="77D5D935">
-            <wp:extent cx="5730875" cy="6161303"/>
-            <wp:effectExtent l="0" t="0" r="3175" b="0"/>
-            <wp:docPr id="8" name="Picture 8"/>
+          <wp:inline distT="0" distB="0" distL="0" distR="0" wp14:anchorId="553FE0B2" wp14:editId="15A8A490">
+            <wp:extent cx="3092101" cy="3043792"/>
+            <wp:effectExtent l="0" t="0" r="0" b="4445"/>
+            <wp:docPr id="3" name="Picture 3"/>
             <wp:cNvGraphicFramePr>
               <a:graphicFrameLocks xmlns:a="http://schemas.openxmlformats.org/drawingml/2006/main" noChangeAspect="1"/>
             </wp:cNvGraphicFramePr>
@@ -1238,7 +1102,7 @@
                   <pic:spPr>
                     <a:xfrm>
                       <a:off x="0" y="0"/>
-                      <a:ext cx="5730875" cy="6161303"/>
+                      <a:ext cx="3121421" cy="3072654"/>
                     </a:xfrm>
                     <a:prstGeom prst="rect">
                       <a:avLst/>
@@ -1251,19 +1115,39 @@
         </w:drawing>
       </w:r>
     </w:p>
-    <w:p/>
-    <w:p>
-      <w:pPr>
-        <w:pStyle w:val="Heading1"/>
-        <w:rPr>
-          <w:color w:val="auto"/>
-        </w:rPr>
-      </w:pPr>
-      <w:r>
-        <w:rPr>
-          <w:color w:val="auto"/>
-        </w:rPr>
-        <w:t>TAUTAN URL</w:t>
+    <w:p>
+      <w:pPr>
+        <w:pStyle w:val="NormalWeb"/>
+        <w:jc w:val="center"/>
+        <w:rPr>
+          <w:b/>
+          <w:bCs/>
+        </w:rPr>
+      </w:pPr>
+      <w:r>
+        <w:rPr>
+          <w:b/>
+          <w:bCs/>
+        </w:rPr>
+        <w:t>GAMBAR 3: Konfigurasi Node Google Gemini Chat Model &amp; Credential</w:t>
+      </w:r>
+    </w:p>
+    <w:p>
+      <w:pPr>
+        <w:pStyle w:val="NormalWeb"/>
+      </w:pPr>
+      <w:r>
+        <w:t>Langkah 4: Konfigurasi Chat Memory (</w:t>
+      </w:r>
+      <w:r>
+        <w:rPr>
+          <w:rStyle w:val="HTMLCode"/>
+          <w:rFonts w:ascii="Times New Roman" w:eastAsiaTheme="majorEastAsia" w:hAnsi="Times New Roman" w:cs="Times New Roman"/>
+        </w:rPr>
+        <w:t>Window Buffer Memory</w:t>
+      </w:r>
+      <w:r>
+        <w:t>)</w:t>
       </w:r>
     </w:p>
     <w:p>
@@ -1271,23 +1155,986 @@
         <w:pStyle w:val="NormalWeb"/>
         <w:numPr>
           <w:ilvl w:val="0"/>
-          <w:numId w:val="8"/>
+          <w:numId w:val="15"/>
         </w:numPr>
       </w:pPr>
       <w:r>
+        <w:t xml:space="preserve">Menggunakan sub-node </w:t>
+      </w:r>
+      <w:r>
+        <w:rPr>
+          <w:rStyle w:val="HTMLCode"/>
+          <w:rFonts w:ascii="Times New Roman" w:eastAsiaTheme="majorEastAsia" w:hAnsi="Times New Roman" w:cs="Times New Roman"/>
+        </w:rPr>
+        <w:t>@n8n/n8n-nodes-langchain.memoryBufferWindow</w:t>
+      </w:r>
+      <w:r>
+        <w:t>.</w:t>
+      </w:r>
+    </w:p>
+    <w:p>
+      <w:pPr>
+        <w:pStyle w:val="NormalWeb"/>
+        <w:numPr>
+          <w:ilvl w:val="0"/>
+          <w:numId w:val="15"/>
+        </w:numPr>
+      </w:pPr>
+      <w:r>
+        <w:t xml:space="preserve">Kapasitas memory diatur dengan </w:t>
+      </w:r>
+      <w:r>
+        <w:rPr>
+          <w:rStyle w:val="HTMLCode"/>
+          <w:rFonts w:ascii="Times New Roman" w:eastAsiaTheme="majorEastAsia" w:hAnsi="Times New Roman" w:cs="Times New Roman"/>
+        </w:rPr>
+        <w:t>Context Window Length = 5</w:t>
+      </w:r>
+      <w:r>
+        <w:t xml:space="preserve"> untuk menyimpan 5 percakapan terakhir agar percakapan berlangsung secara kontekstual.</w:t>
+      </w:r>
+    </w:p>
+    <w:p>
+      <w:pPr>
+        <w:pStyle w:val="NormalWeb"/>
+        <w:jc w:val="center"/>
         <w:rPr>
           <w:b/>
           <w:bCs/>
         </w:rPr>
-        <w:t>URL Web Chatbot (Public Chat):</w:t>
+      </w:pPr>
+      <w:r>
+        <w:rPr>
+          <w:b/>
+          <w:bCs/>
+        </w:rPr>
+        <w:lastRenderedPageBreak/>
+        <w:drawing>
+          <wp:inline distT="0" distB="0" distL="0" distR="0" wp14:anchorId="5404D3DD" wp14:editId="58C74177">
+            <wp:extent cx="3246131" cy="3124200"/>
+            <wp:effectExtent l="0" t="0" r="0" b="0"/>
+            <wp:docPr id="4" name="Picture 4"/>
+            <wp:cNvGraphicFramePr>
+              <a:graphicFrameLocks xmlns:a="http://schemas.openxmlformats.org/drawingml/2006/main" noChangeAspect="1"/>
+            </wp:cNvGraphicFramePr>
+            <a:graphic xmlns:a="http://schemas.openxmlformats.org/drawingml/2006/main">
+              <a:graphicData uri="http://schemas.openxmlformats.org/drawingml/2006/picture">
+                <pic:pic xmlns:pic="http://schemas.openxmlformats.org/drawingml/2006/picture">
+                  <pic:nvPicPr>
+                    <pic:cNvPr id="1" name=""/>
+                    <pic:cNvPicPr/>
+                  </pic:nvPicPr>
+                  <pic:blipFill>
+                    <a:blip r:embed="rId10"/>
+                    <a:stretch>
+                      <a:fillRect/>
+                    </a:stretch>
+                  </pic:blipFill>
+                  <pic:spPr>
+                    <a:xfrm>
+                      <a:off x="0" y="0"/>
+                      <a:ext cx="3279225" cy="3156051"/>
+                    </a:xfrm>
+                    <a:prstGeom prst="rect">
+                      <a:avLst/>
+                    </a:prstGeom>
+                  </pic:spPr>
+                </pic:pic>
+              </a:graphicData>
+            </a:graphic>
+          </wp:inline>
+        </w:drawing>
       </w:r>
     </w:p>
     <w:p>
       <w:pPr>
         <w:pStyle w:val="NormalWeb"/>
-        <w:ind w:left="720"/>
-      </w:pPr>
-      <w:hyperlink r:id="rId10" w:history="1">
+        <w:jc w:val="center"/>
+      </w:pPr>
+      <w:r>
+        <w:rPr>
+          <w:b/>
+          <w:bCs/>
+        </w:rPr>
+        <w:t>GAMBAR 4: Konfigurasi Node Window Buffer Memory</w:t>
+      </w:r>
+    </w:p>
+    <w:p>
+      <w:pPr>
+        <w:pStyle w:val="Heading4"/>
+        <w:rPr>
+          <w:rFonts w:ascii="Times New Roman" w:hAnsi="Times New Roman" w:cs="Times New Roman"/>
+          <w:color w:val="auto"/>
+        </w:rPr>
+      </w:pPr>
+      <w:r>
+        <w:rPr>
+          <w:rFonts w:ascii="Times New Roman" w:hAnsi="Times New Roman" w:cs="Times New Roman"/>
+          <w:color w:val="auto"/>
+        </w:rPr>
+        <w:t>Langkah 5: Konfigurasi Tool Data (</w:t>
+      </w:r>
+      <w:r>
+        <w:rPr>
+          <w:rStyle w:val="HTMLCode"/>
+          <w:rFonts w:ascii="Times New Roman" w:eastAsiaTheme="majorEastAsia" w:hAnsi="Times New Roman" w:cs="Times New Roman"/>
+          <w:color w:val="auto"/>
+        </w:rPr>
+        <w:t>Get row(s) in sheet in Google Sheets</w:t>
+      </w:r>
+      <w:r>
+        <w:rPr>
+          <w:rFonts w:ascii="Times New Roman" w:hAnsi="Times New Roman" w:cs="Times New Roman"/>
+          <w:color w:val="auto"/>
+        </w:rPr>
+        <w:t>)</w:t>
+      </w:r>
+    </w:p>
+    <w:p>
+      <w:pPr>
+        <w:pStyle w:val="NormalWeb"/>
+        <w:numPr>
+          <w:ilvl w:val="0"/>
+          <w:numId w:val="16"/>
+        </w:numPr>
+      </w:pPr>
+      <w:r>
+        <w:t xml:space="preserve">Menggunakan sub-node </w:t>
+      </w:r>
+      <w:r>
+        <w:rPr>
+          <w:rStyle w:val="HTMLCode"/>
+          <w:rFonts w:ascii="Times New Roman" w:eastAsiaTheme="majorEastAsia" w:hAnsi="Times New Roman" w:cs="Times New Roman"/>
+        </w:rPr>
+        <w:t>@n8n/n8n-nodes-langchain.toolGoogleSheets</w:t>
+      </w:r>
+      <w:r>
+        <w:t xml:space="preserve"> bertipe Tool AI Agent.</w:t>
+      </w:r>
+    </w:p>
+    <w:p>
+      <w:pPr>
+        <w:pStyle w:val="NormalWeb"/>
+        <w:numPr>
+          <w:ilvl w:val="0"/>
+          <w:numId w:val="16"/>
+        </w:numPr>
+      </w:pPr>
+      <w:r>
+        <w:t xml:space="preserve">Operation diatur ke </w:t>
+      </w:r>
+      <w:r>
+        <w:rPr>
+          <w:rStyle w:val="HTMLCode"/>
+          <w:rFonts w:ascii="Times New Roman" w:eastAsiaTheme="majorEastAsia" w:hAnsi="Times New Roman" w:cs="Times New Roman"/>
+        </w:rPr>
+        <w:t>Get Row(s)</w:t>
+      </w:r>
+      <w:r>
+        <w:t>.</w:t>
+      </w:r>
+    </w:p>
+    <w:p>
+      <w:pPr>
+        <w:pStyle w:val="NormalWeb"/>
+        <w:numPr>
+          <w:ilvl w:val="0"/>
+          <w:numId w:val="16"/>
+        </w:numPr>
+      </w:pPr>
+      <w:r>
+        <w:t xml:space="preserve">Dihubungkan menggunakan OAuth2 Google Account dan diarahkan ke URL spreadsheet serta nama sheet </w:t>
+      </w:r>
+      <w:r>
+        <w:rPr>
+          <w:rStyle w:val="HTMLCode"/>
+          <w:rFonts w:ascii="Times New Roman" w:eastAsiaTheme="majorEastAsia" w:hAnsi="Times New Roman" w:cs="Times New Roman"/>
+        </w:rPr>
+        <w:t>Sheet1</w:t>
+      </w:r>
+      <w:r>
+        <w:t>.</w:t>
+      </w:r>
+    </w:p>
+    <w:p>
+      <w:pPr>
+        <w:pStyle w:val="NormalWeb"/>
+        <w:jc w:val="center"/>
+        <w:rPr>
+          <w:b/>
+          <w:bCs/>
+        </w:rPr>
+      </w:pPr>
+      <w:r>
+        <w:rPr>
+          <w:b/>
+          <w:bCs/>
+        </w:rPr>
+        <w:drawing>
+          <wp:inline distT="0" distB="0" distL="0" distR="0" wp14:anchorId="19E0EAC3" wp14:editId="06F0742D">
+            <wp:extent cx="3282950" cy="3234933"/>
+            <wp:effectExtent l="0" t="0" r="0" b="3810"/>
+            <wp:docPr id="5" name="Picture 5"/>
+            <wp:cNvGraphicFramePr>
+              <a:graphicFrameLocks xmlns:a="http://schemas.openxmlformats.org/drawingml/2006/main" noChangeAspect="1"/>
+            </wp:cNvGraphicFramePr>
+            <a:graphic xmlns:a="http://schemas.openxmlformats.org/drawingml/2006/main">
+              <a:graphicData uri="http://schemas.openxmlformats.org/drawingml/2006/picture">
+                <pic:pic xmlns:pic="http://schemas.openxmlformats.org/drawingml/2006/picture">
+                  <pic:nvPicPr>
+                    <pic:cNvPr id="1" name=""/>
+                    <pic:cNvPicPr/>
+                  </pic:nvPicPr>
+                  <pic:blipFill>
+                    <a:blip r:embed="rId11"/>
+                    <a:stretch>
+                      <a:fillRect/>
+                    </a:stretch>
+                  </pic:blipFill>
+                  <pic:spPr>
+                    <a:xfrm>
+                      <a:off x="0" y="0"/>
+                      <a:ext cx="3296097" cy="3247888"/>
+                    </a:xfrm>
+                    <a:prstGeom prst="rect">
+                      <a:avLst/>
+                    </a:prstGeom>
+                  </pic:spPr>
+                </pic:pic>
+              </a:graphicData>
+            </a:graphic>
+          </wp:inline>
+        </w:drawing>
+      </w:r>
+    </w:p>
+    <w:p>
+      <w:pPr>
+        <w:pStyle w:val="NormalWeb"/>
+        <w:jc w:val="center"/>
+      </w:pPr>
+      <w:r>
+        <w:rPr>
+          <w:b/>
+          <w:bCs/>
+        </w:rPr>
+        <w:t>GAMBAR 5: Konfigurasi Node Google Sheets Tool</w:t>
+      </w:r>
+    </w:p>
+    <w:p>
+      <w:pPr>
+        <w:pStyle w:val="Heading4"/>
+        <w:rPr>
+          <w:rFonts w:ascii="Times New Roman" w:hAnsi="Times New Roman" w:cs="Times New Roman"/>
+          <w:color w:val="auto"/>
+        </w:rPr>
+      </w:pPr>
+      <w:r>
+        <w:rPr>
+          <w:rFonts w:ascii="Times New Roman" w:hAnsi="Times New Roman" w:cs="Times New Roman"/>
+          <w:color w:val="auto"/>
+        </w:rPr>
+        <w:lastRenderedPageBreak/>
+        <w:t>Langkah 6: Perancangan System Message / Prompting pada AI Agent</w:t>
+      </w:r>
+    </w:p>
+    <w:p>
+      <w:pPr>
+        <w:pStyle w:val="NormalWeb"/>
+        <w:numPr>
+          <w:ilvl w:val="0"/>
+          <w:numId w:val="17"/>
+        </w:numPr>
+      </w:pPr>
+      <w:r>
+        <w:t xml:space="preserve">System Message dirancang dengan instruksi ketat agar AI Agent </w:t>
+      </w:r>
+      <w:r>
+        <w:rPr>
+          <w:b/>
+          <w:bCs/>
+        </w:rPr>
+        <w:t>selalu memanggil Tool Google Sheets</w:t>
+      </w:r>
+      <w:r>
+        <w:t xml:space="preserve"> setiap kali ada pertanyaan mengenai daftar produk atau harga, serta melarang AI memberikan jawaban fiktif (</w:t>
+      </w:r>
+      <w:r>
+        <w:rPr>
+          <w:i/>
+          <w:iCs/>
+        </w:rPr>
+        <w:t>hallucination</w:t>
+      </w:r>
+      <w:r>
+        <w:t>).</w:t>
+      </w:r>
+    </w:p>
+    <w:p>
+      <w:pPr>
+        <w:pStyle w:val="NormalWeb"/>
+        <w:jc w:val="center"/>
+        <w:rPr>
+          <w:b/>
+          <w:bCs/>
+        </w:rPr>
+      </w:pPr>
+      <w:r>
+        <w:rPr>
+          <w:b/>
+          <w:bCs/>
+        </w:rPr>
+        <w:drawing>
+          <wp:inline distT="0" distB="0" distL="0" distR="0" wp14:anchorId="030B625F" wp14:editId="0C46B19D">
+            <wp:extent cx="3892550" cy="3811464"/>
+            <wp:effectExtent l="0" t="0" r="0" b="0"/>
+            <wp:docPr id="7" name="Picture 7"/>
+            <wp:cNvGraphicFramePr>
+              <a:graphicFrameLocks xmlns:a="http://schemas.openxmlformats.org/drawingml/2006/main" noChangeAspect="1"/>
+            </wp:cNvGraphicFramePr>
+            <a:graphic xmlns:a="http://schemas.openxmlformats.org/drawingml/2006/main">
+              <a:graphicData uri="http://schemas.openxmlformats.org/drawingml/2006/picture">
+                <pic:pic xmlns:pic="http://schemas.openxmlformats.org/drawingml/2006/picture">
+                  <pic:nvPicPr>
+                    <pic:cNvPr id="1" name=""/>
+                    <pic:cNvPicPr/>
+                  </pic:nvPicPr>
+                  <pic:blipFill>
+                    <a:blip r:embed="rId12"/>
+                    <a:stretch>
+                      <a:fillRect/>
+                    </a:stretch>
+                  </pic:blipFill>
+                  <pic:spPr>
+                    <a:xfrm>
+                      <a:off x="0" y="0"/>
+                      <a:ext cx="3923971" cy="3842231"/>
+                    </a:xfrm>
+                    <a:prstGeom prst="rect">
+                      <a:avLst/>
+                    </a:prstGeom>
+                  </pic:spPr>
+                </pic:pic>
+              </a:graphicData>
+            </a:graphic>
+          </wp:inline>
+        </w:drawing>
+      </w:r>
+    </w:p>
+    <w:p>
+      <w:pPr>
+        <w:pStyle w:val="NormalWeb"/>
+        <w:jc w:val="center"/>
+        <w:rPr>
+          <w:i/>
+          <w:iCs/>
+        </w:rPr>
+      </w:pPr>
+      <w:r>
+        <w:rPr>
+          <w:b/>
+          <w:bCs/>
+        </w:rPr>
+        <w:t>GAMBAR 6: Konfigurasi System Message pada Node AI Agent</w:t>
+      </w:r>
+      <w:r>
+        <w:t xml:space="preserve"> </w:t>
+      </w:r>
+    </w:p>
+    <w:p>
+      <w:pPr>
+        <w:pStyle w:val="NormalWeb"/>
+        <w:jc w:val="center"/>
+        <w:rPr>
+          <w:rFonts w:ascii="Segoe UI Emoji" w:hAnsi="Segoe UI Emoji" w:cs="Segoe UI Emoji"/>
+        </w:rPr>
+      </w:pPr>
+      <w:r>
+        <w:rPr>
+          <w:rFonts w:ascii="Segoe UI Emoji" w:hAnsi="Segoe UI Emoji" w:cs="Segoe UI Emoji"/>
+        </w:rPr>
+        <w:drawing>
+          <wp:inline distT="0" distB="0" distL="0" distR="0" wp14:anchorId="5ED4079F" wp14:editId="71F26C8F">
+            <wp:extent cx="4054475" cy="2046331"/>
+            <wp:effectExtent l="0" t="0" r="3175" b="0"/>
+            <wp:docPr id="10" name="Picture 10"/>
+            <wp:cNvGraphicFramePr>
+              <a:graphicFrameLocks xmlns:a="http://schemas.openxmlformats.org/drawingml/2006/main" noChangeAspect="1"/>
+            </wp:cNvGraphicFramePr>
+            <a:graphic xmlns:a="http://schemas.openxmlformats.org/drawingml/2006/main">
+              <a:graphicData uri="http://schemas.openxmlformats.org/drawingml/2006/picture">
+                <pic:pic xmlns:pic="http://schemas.openxmlformats.org/drawingml/2006/picture">
+                  <pic:nvPicPr>
+                    <pic:cNvPr id="1" name=""/>
+                    <pic:cNvPicPr/>
+                  </pic:nvPicPr>
+                  <pic:blipFill>
+                    <a:blip r:embed="rId13"/>
+                    <a:stretch>
+                      <a:fillRect/>
+                    </a:stretch>
+                  </pic:blipFill>
+                  <pic:spPr>
+                    <a:xfrm>
+                      <a:off x="0" y="0"/>
+                      <a:ext cx="4088538" cy="2063523"/>
+                    </a:xfrm>
+                    <a:prstGeom prst="rect">
+                      <a:avLst/>
+                    </a:prstGeom>
+                  </pic:spPr>
+                </pic:pic>
+              </a:graphicData>
+            </a:graphic>
+          </wp:inline>
+        </w:drawing>
+      </w:r>
+    </w:p>
+    <w:p>
+      <w:pPr>
+        <w:pStyle w:val="NormalWeb"/>
+        <w:jc w:val="center"/>
+        <w:rPr>
+          <w:b/>
+          <w:bCs/>
+        </w:rPr>
+      </w:pPr>
+      <w:r>
+        <w:rPr>
+          <w:b/>
+          <w:bCs/>
+        </w:rPr>
+        <w:t>GAMBAR 7: Rangkaian Utuh Workflow di Canvas n8n</w:t>
+      </w:r>
+    </w:p>
+    <w:p>
+      <w:pPr>
+        <w:pStyle w:val="NormalWeb"/>
+      </w:pPr>
+    </w:p>
+    <w:p>
+      <w:pPr>
+        <w:pStyle w:val="Heading4"/>
+        <w:rPr>
+          <w:rFonts w:ascii="Times New Roman" w:hAnsi="Times New Roman" w:cs="Times New Roman"/>
+          <w:color w:val="auto"/>
+        </w:rPr>
+      </w:pPr>
+      <w:r>
+        <w:rPr>
+          <w:rFonts w:ascii="Times New Roman" w:hAnsi="Times New Roman" w:cs="Times New Roman"/>
+          <w:color w:val="auto"/>
+        </w:rPr>
+        <w:lastRenderedPageBreak/>
+        <w:t>Langkah 7: Pengujian Eksekusi dan Respons pada Canvas n8n</w:t>
+      </w:r>
+    </w:p>
+    <w:p>
+      <w:pPr>
+        <w:pStyle w:val="NormalWeb"/>
+        <w:numPr>
+          <w:ilvl w:val="0"/>
+          <w:numId w:val="18"/>
+        </w:numPr>
+      </w:pPr>
+      <w:r>
+        <w:t xml:space="preserve">Pengujian dilakukan langsung di dalam canvas n8n menggunakan panel </w:t>
+      </w:r>
+      <w:r>
+        <w:rPr>
+          <w:b/>
+          <w:bCs/>
+        </w:rPr>
+        <w:t>Chat Widget</w:t>
+      </w:r>
+      <w:r>
+        <w:t>.</w:t>
+      </w:r>
+    </w:p>
+    <w:p>
+      <w:pPr>
+        <w:pStyle w:val="NormalWeb"/>
+        <w:numPr>
+          <w:ilvl w:val="0"/>
+          <w:numId w:val="18"/>
+        </w:numPr>
+      </w:pPr>
+      <w:r>
+        <w:rPr>
+          <w:b/>
+          <w:bCs/>
+        </w:rPr>
+        <w:t>Pertanyaan Tes</w:t>
+      </w:r>
+      <w:r>
+        <w:t xml:space="preserve">: </w:t>
+      </w:r>
+      <w:r>
+        <w:rPr>
+          <w:i/>
+          <w:iCs/>
+        </w:rPr>
+        <w:t>"Apa saja program bootcamp yang tersedia dan berapa harganya?"</w:t>
+      </w:r>
+    </w:p>
+    <w:p>
+      <w:pPr>
+        <w:pStyle w:val="NormalWeb"/>
+        <w:numPr>
+          <w:ilvl w:val="0"/>
+          <w:numId w:val="18"/>
+        </w:numPr>
+      </w:pPr>
+      <w:r>
+        <w:rPr>
+          <w:b/>
+          <w:bCs/>
+        </w:rPr>
+        <w:t>Hasil</w:t>
+      </w:r>
+      <w:r>
+        <w:t>: AI Agent sukses mengaktifkan Tool Google Sheets, mengambil data pelatihan (seperti Digital Marketing, Network Engineering, Web Development, Cyber Security, dll. seharga Rp15.000.000), dan menampilkan jawaban yang rapi.</w:t>
+      </w:r>
+    </w:p>
+    <w:p>
+      <w:pPr>
+        <w:pStyle w:val="NormalWeb"/>
+        <w:jc w:val="center"/>
+        <w:rPr>
+          <w:rFonts w:ascii="Segoe UI Emoji" w:hAnsi="Segoe UI Emoji" w:cs="Segoe UI Emoji"/>
+        </w:rPr>
+      </w:pPr>
+      <w:r>
+        <w:rPr>
+          <w:rFonts w:ascii="Segoe UI Emoji" w:hAnsi="Segoe UI Emoji" w:cs="Segoe UI Emoji"/>
+        </w:rPr>
+        <w:drawing>
+          <wp:inline distT="0" distB="0" distL="0" distR="0" wp14:anchorId="65CE52FA" wp14:editId="79C57FD5">
+            <wp:extent cx="3745788" cy="1905000"/>
+            <wp:effectExtent l="0" t="0" r="7620" b="0"/>
+            <wp:docPr id="9" name="Picture 9"/>
+            <wp:cNvGraphicFramePr>
+              <a:graphicFrameLocks xmlns:a="http://schemas.openxmlformats.org/drawingml/2006/main" noChangeAspect="1"/>
+            </wp:cNvGraphicFramePr>
+            <a:graphic xmlns:a="http://schemas.openxmlformats.org/drawingml/2006/main">
+              <a:graphicData uri="http://schemas.openxmlformats.org/drawingml/2006/picture">
+                <pic:pic xmlns:pic="http://schemas.openxmlformats.org/drawingml/2006/picture">
+                  <pic:nvPicPr>
+                    <pic:cNvPr id="1" name=""/>
+                    <pic:cNvPicPr/>
+                  </pic:nvPicPr>
+                  <pic:blipFill rotWithShape="1">
+                    <a:blip r:embed="rId14"/>
+                    <a:srcRect b="48061"/>
+                    <a:stretch/>
+                  </pic:blipFill>
+                  <pic:spPr bwMode="auto">
+                    <a:xfrm>
+                      <a:off x="0" y="0"/>
+                      <a:ext cx="3781853" cy="1923342"/>
+                    </a:xfrm>
+                    <a:prstGeom prst="rect">
+                      <a:avLst/>
+                    </a:prstGeom>
+                    <a:ln>
+                      <a:noFill/>
+                    </a:ln>
+                    <a:extLst>
+                      <a:ext uri="{53640926-AAD7-44D8-BBD7-CCE9431645EC}">
+                        <a14:shadowObscured xmlns:a14="http://schemas.microsoft.com/office/drawing/2010/main"/>
+                      </a:ext>
+                    </a:extLst>
+                  </pic:spPr>
+                </pic:pic>
+              </a:graphicData>
+            </a:graphic>
+          </wp:inline>
+        </w:drawing>
+      </w:r>
+    </w:p>
+    <w:p>
+      <w:pPr>
+        <w:pStyle w:val="NormalWeb"/>
+        <w:jc w:val="center"/>
+      </w:pPr>
+      <w:r>
+        <w:rPr>
+          <w:b/>
+          <w:bCs/>
+        </w:rPr>
+        <w:t>GAMBAR 8: Proses Running Execution di Canvas n8n</w:t>
+      </w:r>
+    </w:p>
+    <w:p>
+      <w:pPr>
+        <w:pStyle w:val="NormalWeb"/>
+        <w:jc w:val="center"/>
+        <w:rPr>
+          <w:rFonts w:ascii="Segoe UI Emoji" w:hAnsi="Segoe UI Emoji" w:cs="Segoe UI Emoji"/>
+        </w:rPr>
+      </w:pPr>
+      <w:r>
+        <w:rPr>
+          <w:rFonts w:ascii="Segoe UI Emoji" w:hAnsi="Segoe UI Emoji" w:cs="Segoe UI Emoji"/>
+        </w:rPr>
+        <w:drawing>
+          <wp:inline distT="0" distB="0" distL="0" distR="0" wp14:anchorId="42842123" wp14:editId="7509AEA2">
+            <wp:extent cx="3745788" cy="1791335"/>
+            <wp:effectExtent l="0" t="0" r="7620" b="0"/>
+            <wp:docPr id="11" name="Picture 11"/>
+            <wp:cNvGraphicFramePr>
+              <a:graphicFrameLocks xmlns:a="http://schemas.openxmlformats.org/drawingml/2006/main" noChangeAspect="1"/>
+            </wp:cNvGraphicFramePr>
+            <a:graphic xmlns:a="http://schemas.openxmlformats.org/drawingml/2006/main">
+              <a:graphicData uri="http://schemas.openxmlformats.org/drawingml/2006/picture">
+                <pic:pic xmlns:pic="http://schemas.openxmlformats.org/drawingml/2006/picture">
+                  <pic:nvPicPr>
+                    <pic:cNvPr id="1" name=""/>
+                    <pic:cNvPicPr/>
+                  </pic:nvPicPr>
+                  <pic:blipFill rotWithShape="1">
+                    <a:blip r:embed="rId14"/>
+                    <a:srcRect t="51160"/>
+                    <a:stretch/>
+                  </pic:blipFill>
+                  <pic:spPr bwMode="auto">
+                    <a:xfrm>
+                      <a:off x="0" y="0"/>
+                      <a:ext cx="3781853" cy="1808582"/>
+                    </a:xfrm>
+                    <a:prstGeom prst="rect">
+                      <a:avLst/>
+                    </a:prstGeom>
+                    <a:ln>
+                      <a:noFill/>
+                    </a:ln>
+                    <a:extLst>
+                      <a:ext uri="{53640926-AAD7-44D8-BBD7-CCE9431645EC}">
+                        <a14:shadowObscured xmlns:a14="http://schemas.microsoft.com/office/drawing/2010/main"/>
+                      </a:ext>
+                    </a:extLst>
+                  </pic:spPr>
+                </pic:pic>
+              </a:graphicData>
+            </a:graphic>
+          </wp:inline>
+        </w:drawing>
+      </w:r>
+    </w:p>
+    <w:p>
+      <w:pPr>
+        <w:pStyle w:val="NormalWeb"/>
+        <w:jc w:val="center"/>
+      </w:pPr>
+      <w:r>
+        <w:rPr>
+          <w:b/>
+          <w:bCs/>
+        </w:rPr>
+        <w:t>GAMBAR 9: Hasil Pengujian Chat di Panel Chat Canvas n8n</w:t>
+      </w:r>
+    </w:p>
+    <w:p>
+      <w:pPr>
+        <w:pStyle w:val="Heading4"/>
+        <w:rPr>
+          <w:rFonts w:ascii="Times New Roman" w:hAnsi="Times New Roman" w:cs="Times New Roman"/>
+          <w:color w:val="auto"/>
+        </w:rPr>
+      </w:pPr>
+      <w:r>
+        <w:rPr>
+          <w:rFonts w:ascii="Times New Roman" w:hAnsi="Times New Roman" w:cs="Times New Roman"/>
+          <w:color w:val="auto"/>
+        </w:rPr>
+        <w:t>Langkah 8: Penerbitan Workflow (Publish) dan Pengujian pada Tautan Web Public</w:t>
+      </w:r>
+    </w:p>
+    <w:p>
+      <w:pPr>
+        <w:pStyle w:val="NormalWeb"/>
+        <w:numPr>
+          <w:ilvl w:val="0"/>
+          <w:numId w:val="19"/>
+        </w:numPr>
+      </w:pPr>
+      <w:r>
+        <w:t xml:space="preserve">Workflow berhasil diterbitkan dengan mengubah status menjadi </w:t>
+      </w:r>
+      <w:r>
+        <w:rPr>
+          <w:b/>
+          <w:bCs/>
+        </w:rPr>
+        <w:t>Published (Active)</w:t>
+      </w:r>
+      <w:r>
+        <w:t>.</w:t>
+      </w:r>
+    </w:p>
+    <w:p>
+      <w:pPr>
+        <w:pStyle w:val="NormalWeb"/>
+        <w:numPr>
+          <w:ilvl w:val="0"/>
+          <w:numId w:val="19"/>
+        </w:numPr>
+      </w:pPr>
+      <w:r>
+        <w:t>Tautan URL Web Chat dipasang dan diuji cobakan melalui tab browser eksternal.</w:t>
+      </w:r>
+    </w:p>
+    <w:p>
+      <w:pPr>
+        <w:pStyle w:val="NormalWeb"/>
+        <w:jc w:val="center"/>
+        <w:rPr>
+          <w:rFonts w:ascii="Segoe UI Emoji" w:hAnsi="Segoe UI Emoji" w:cs="Segoe UI Emoji"/>
+        </w:rPr>
+      </w:pPr>
+    </w:p>
+    <w:p>
+      <w:pPr>
+        <w:pStyle w:val="NormalWeb"/>
+        <w:jc w:val="center"/>
+        <w:rPr>
+          <w:b/>
+          <w:bCs/>
+        </w:rPr>
+      </w:pPr>
+      <w:r>
+        <w:rPr>
+          <w:rFonts w:ascii="Segoe UI Emoji" w:hAnsi="Segoe UI Emoji" w:cs="Segoe UI Emoji"/>
+        </w:rPr>
+        <w:lastRenderedPageBreak/>
+        <w:drawing>
+          <wp:inline distT="0" distB="0" distL="0" distR="0" wp14:anchorId="3E24538E" wp14:editId="02646545">
+            <wp:extent cx="3745230" cy="3648075"/>
+            <wp:effectExtent l="0" t="0" r="7620" b="9525"/>
+            <wp:docPr id="12" name="Picture 12"/>
+            <wp:cNvGraphicFramePr>
+              <a:graphicFrameLocks xmlns:a="http://schemas.openxmlformats.org/drawingml/2006/main" noChangeAspect="1"/>
+            </wp:cNvGraphicFramePr>
+            <a:graphic xmlns:a="http://schemas.openxmlformats.org/drawingml/2006/main">
+              <a:graphicData uri="http://schemas.openxmlformats.org/drawingml/2006/picture">
+                <pic:pic xmlns:pic="http://schemas.openxmlformats.org/drawingml/2006/picture">
+                  <pic:nvPicPr>
+                    <pic:cNvPr id="1" name=""/>
+                    <pic:cNvPicPr/>
+                  </pic:nvPicPr>
+                  <pic:blipFill rotWithShape="1">
+                    <a:blip r:embed="rId14"/>
+                    <a:srcRect b="523"/>
+                    <a:stretch/>
+                  </pic:blipFill>
+                  <pic:spPr bwMode="auto">
+                    <a:xfrm>
+                      <a:off x="0" y="0"/>
+                      <a:ext cx="3781853" cy="3683748"/>
+                    </a:xfrm>
+                    <a:prstGeom prst="rect">
+                      <a:avLst/>
+                    </a:prstGeom>
+                    <a:ln>
+                      <a:noFill/>
+                    </a:ln>
+                    <a:extLst>
+                      <a:ext uri="{53640926-AAD7-44D8-BBD7-CCE9431645EC}">
+                        <a14:shadowObscured xmlns:a14="http://schemas.microsoft.com/office/drawing/2010/main"/>
+                      </a:ext>
+                    </a:extLst>
+                  </pic:spPr>
+                </pic:pic>
+              </a:graphicData>
+            </a:graphic>
+          </wp:inline>
+        </w:drawing>
+      </w:r>
+    </w:p>
+    <w:p>
+      <w:pPr>
+        <w:pStyle w:val="NormalWeb"/>
+        <w:jc w:val="center"/>
+        <w:rPr>
+          <w:i/>
+          <w:iCs/>
+        </w:rPr>
+      </w:pPr>
+      <w:r>
+        <w:rPr>
+          <w:b/>
+          <w:bCs/>
+        </w:rPr>
+        <w:t>GAMBAR 10: Status Workflow dalam Kondisi Published</w:t>
+      </w:r>
+    </w:p>
+    <w:p>
+      <w:pPr>
+        <w:pStyle w:val="NormalWeb"/>
+        <w:jc w:val="center"/>
+      </w:pPr>
+      <w:r>
+        <w:drawing>
+          <wp:inline distT="0" distB="0" distL="0" distR="0" wp14:anchorId="609F9133" wp14:editId="63107087">
+            <wp:extent cx="3731260" cy="3876377"/>
+            <wp:effectExtent l="0" t="0" r="2540" b="0"/>
+            <wp:docPr id="15" name="Picture 15"/>
+            <wp:cNvGraphicFramePr>
+              <a:graphicFrameLocks xmlns:a="http://schemas.openxmlformats.org/drawingml/2006/main" noChangeAspect="1"/>
+            </wp:cNvGraphicFramePr>
+            <a:graphic xmlns:a="http://schemas.openxmlformats.org/drawingml/2006/main">
+              <a:graphicData uri="http://schemas.openxmlformats.org/drawingml/2006/picture">
+                <pic:pic xmlns:pic="http://schemas.openxmlformats.org/drawingml/2006/picture">
+                  <pic:nvPicPr>
+                    <pic:cNvPr id="1" name=""/>
+                    <pic:cNvPicPr/>
+                  </pic:nvPicPr>
+                  <pic:blipFill>
+                    <a:blip r:embed="rId15"/>
+                    <a:stretch>
+                      <a:fillRect/>
+                    </a:stretch>
+                  </pic:blipFill>
+                  <pic:spPr>
+                    <a:xfrm>
+                      <a:off x="0" y="0"/>
+                      <a:ext cx="3757841" cy="3903991"/>
+                    </a:xfrm>
+                    <a:prstGeom prst="rect">
+                      <a:avLst/>
+                    </a:prstGeom>
+                  </pic:spPr>
+                </pic:pic>
+              </a:graphicData>
+            </a:graphic>
+          </wp:inline>
+        </w:drawing>
+      </w:r>
+    </w:p>
+    <w:p>
+      <w:pPr>
+        <w:pStyle w:val="NormalWeb"/>
+        <w:jc w:val="center"/>
+      </w:pPr>
+      <w:r>
+        <w:rPr>
+          <w:b/>
+          <w:bCs/>
+        </w:rPr>
+        <w:t>GAMBAR 11: Tampilan Antarmuka Webchat Publik</w:t>
+      </w:r>
+    </w:p>
+    <w:p>
+      <w:pPr>
+        <w:pStyle w:val="NormalWeb"/>
+        <w:jc w:val="center"/>
+        <w:rPr>
+          <w:rFonts w:ascii="Segoe UI Emoji" w:hAnsi="Segoe UI Emoji" w:cs="Segoe UI Emoji"/>
+        </w:rPr>
+      </w:pPr>
+      <w:r>
+        <w:rPr>
+          <w:rFonts w:ascii="Segoe UI Emoji" w:hAnsi="Segoe UI Emoji" w:cs="Segoe UI Emoji"/>
+        </w:rPr>
+        <w:lastRenderedPageBreak/>
+        <w:drawing>
+          <wp:inline distT="0" distB="0" distL="0" distR="0" wp14:anchorId="54E826E4" wp14:editId="524A3491">
+            <wp:extent cx="3625692" cy="3576680"/>
+            <wp:effectExtent l="0" t="0" r="0" b="5080"/>
+            <wp:docPr id="14" name="Picture 14"/>
+            <wp:cNvGraphicFramePr>
+              <a:graphicFrameLocks xmlns:a="http://schemas.openxmlformats.org/drawingml/2006/main" noChangeAspect="1"/>
+            </wp:cNvGraphicFramePr>
+            <a:graphic xmlns:a="http://schemas.openxmlformats.org/drawingml/2006/main">
+              <a:graphicData uri="http://schemas.openxmlformats.org/drawingml/2006/picture">
+                <pic:pic xmlns:pic="http://schemas.openxmlformats.org/drawingml/2006/picture">
+                  <pic:nvPicPr>
+                    <pic:cNvPr id="1" name=""/>
+                    <pic:cNvPicPr/>
+                  </pic:nvPicPr>
+                  <pic:blipFill>
+                    <a:blip r:embed="rId16"/>
+                    <a:stretch>
+                      <a:fillRect/>
+                    </a:stretch>
+                  </pic:blipFill>
+                  <pic:spPr>
+                    <a:xfrm>
+                      <a:off x="0" y="0"/>
+                      <a:ext cx="3639173" cy="3589979"/>
+                    </a:xfrm>
+                    <a:prstGeom prst="rect">
+                      <a:avLst/>
+                    </a:prstGeom>
+                  </pic:spPr>
+                </pic:pic>
+              </a:graphicData>
+            </a:graphic>
+          </wp:inline>
+        </w:drawing>
+      </w:r>
+    </w:p>
+    <w:p>
+      <w:pPr>
+        <w:pStyle w:val="NormalWeb"/>
+        <w:jc w:val="center"/>
+        <w:rPr>
+          <w:i/>
+          <w:iCs/>
+        </w:rPr>
+      </w:pPr>
+      <w:r>
+        <w:rPr>
+          <w:b/>
+          <w:bCs/>
+        </w:rPr>
+        <w:t>GAMBAR 12: Bukti Percakapan dan Respon Chatbot di Web Public</w:t>
+      </w:r>
+    </w:p>
+    <w:p>
+      <w:pPr>
+        <w:pStyle w:val="NormalWeb"/>
+        <w:jc w:val="center"/>
+      </w:pPr>
+    </w:p>
+    <w:p>
+      <w:pPr>
+        <w:pStyle w:val="Heading1"/>
+      </w:pPr>
+      <w:r>
+        <w:t>TAUTAN DAN BUKTI PENDUKUNG</w:t>
+      </w:r>
+    </w:p>
+    <w:p>
+      <w:pPr>
+        <w:pStyle w:val="NormalWeb"/>
+        <w:numPr>
+          <w:ilvl w:val="0"/>
+          <w:numId w:val="20"/>
+        </w:numPr>
+      </w:pPr>
+      <w:r>
+        <w:rPr>
+          <w:b/>
+          <w:bCs/>
+        </w:rPr>
+        <w:t>Tautan Web Chatbot Publik (Langkah 8)</w:t>
+      </w:r>
+      <w:r>
+        <w:t>:</w:t>
+      </w:r>
+    </w:p>
+    <w:p>
+      <w:pPr>
+        <w:pStyle w:val="NormalWeb"/>
+        <w:numPr>
+          <w:ilvl w:val="1"/>
+          <w:numId w:val="20"/>
+        </w:numPr>
+      </w:pPr>
+      <w:r>
+        <w:t xml:space="preserve">URL: </w:t>
+      </w:r>
+      <w:hyperlink r:id="rId17" w:history="1">
         <w:r>
           <w:rPr>
             <w:rStyle w:val="Hyperlink"/>
@@ -1295,7 +2142,7 @@
             <w:sz w:val="20"/>
             <w:szCs w:val="20"/>
           </w:rPr>
-          <w:t>https://n8n-6kg7whrm91bu.jkt5.sumopod.my.id/webhook/0da18b47-517d-4398-8a88-99a051bffce6/chat</w:t>
+          <w:t>https://n8n-6kg7whrm91bu.jkt5.sumopod.my.id/webhook/da44482e-b001-4738-b00f-bdcb21398859/chat</w:t>
         </w:r>
       </w:hyperlink>
       <w:r>
@@ -1311,7 +2158,7 @@
         <w:pStyle w:val="NormalWeb"/>
         <w:numPr>
           <w:ilvl w:val="0"/>
-          <w:numId w:val="9"/>
+          <w:numId w:val="20"/>
         </w:numPr>
       </w:pPr>
       <w:r>
@@ -1319,23 +2166,63 @@
           <w:b/>
           <w:bCs/>
         </w:rPr>
-        <w:t>URL Repository / File JSON Workflow:</w:t>
+        <w:t>Tautan Repository File JSON Workflow di GitHub (Langkah 9d)</w:t>
+      </w:r>
+      <w:r>
+        <w:t>:</w:t>
       </w:r>
     </w:p>
     <w:p>
       <w:pPr>
         <w:pStyle w:val="NormalWeb"/>
-        <w:ind w:left="720"/>
-      </w:pPr>
-      <w:hyperlink r:id="rId11" w:tgtFrame="_blank" w:history="1">
+        <w:numPr>
+          <w:ilvl w:val="1"/>
+          <w:numId w:val="20"/>
+        </w:numPr>
+      </w:pPr>
+      <w:r>
+        <w:t xml:space="preserve">URL: </w:t>
+      </w:r>
+      <w:hyperlink r:id="rId18" w:history="1">
         <w:r>
           <w:rPr>
             <w:rStyle w:val="Hyperlink"/>
-            <w:color w:val="auto"/>
+            <w:rFonts w:eastAsiaTheme="majorEastAsia"/>
+            <w:sz w:val="20"/>
+            <w:szCs w:val="20"/>
           </w:rPr>
-          <w:t>https://github.com/Riansyah96/PembuatanWorkFlow-n8n-NFA/blob/main/AI%20Web%20Chatbot%20Agent%20-%20Gemini%20Final.json</w:t>
+          <w:t>https://github.com/Riansyah96/PembuatanWorkFlow-n8n-NFA/blob/main/JSON%20Workflow%20n8n%20Chatbot%20Gemini%20Google%20Sheets.json</w:t>
         </w:r>
       </w:hyperlink>
+      <w:r>
+        <w:rPr>
+          <w:rStyle w:val="HTMLCode"/>
+          <w:rFonts w:ascii="Times New Roman" w:eastAsiaTheme="majorEastAsia" w:hAnsi="Times New Roman" w:cs="Times New Roman"/>
+        </w:rPr>
+        <w:t xml:space="preserve"> </w:t>
+      </w:r>
+    </w:p>
+    <w:p>
+      <w:pPr>
+        <w:pStyle w:val="Heading1"/>
+      </w:pPr>
+      <w:r>
+        <w:t>PENUTUP DAN KESIMPULAN</w:t>
+      </w:r>
+    </w:p>
+    <w:p>
+      <w:pPr>
+        <w:pStyle w:val="NormalWeb"/>
+      </w:pPr>
+      <w:r>
+        <w:t>Seluruh tahapan perancangan, integrasi sub-node LangChain (Gemini Model, Memory, dan Google Sheets Tool), pengujian internal pada canvas n8n, hingga publikasi antarmuka webchat telah diselesaikan dan tervalidasi 100% berfungsi sesuai dengan spesifikasi kriteria tugas.</w:t>
+      </w:r>
+    </w:p>
+    <w:p>
+      <w:pPr>
+        <w:pStyle w:val="NormalWeb"/>
+        <w:ind w:left="720"/>
+      </w:pPr>
       <w:r>
         <w:t xml:space="preserve"> </w:t>
       </w:r>
@@ -1352,6 +2239,304 @@
 <file path=word/numbering.xml><?xml version="1.0" encoding="utf-8"?>
 <w:numbering xmlns:wpc="http://schemas.microsoft.com/office/word/2010/wordprocessingCanvas" xmlns:cx="http://schemas.microsoft.com/office/drawing/2014/chartex" xmlns:cx1="http://schemas.microsoft.com/office/drawing/2015/9/8/chartex" xmlns:cx2="http://schemas.microsoft.com/office/drawing/2015/10/21/chartex" xmlns:cx3="http://schemas.microsoft.com/office/drawing/2016/5/9/chartex" xmlns:cx4="http://schemas.microsoft.com/office/drawing/2016/5/10/chartex" xmlns:cx5="http://schemas.microsoft.com/office/drawing/2016/5/11/chartex" xmlns:cx6="http://schemas.microsoft.com/office/drawing/2016/5/12/chartex" xmlns:cx7="http://schemas.microsoft.com/office/drawing/2016/5/13/chartex" xmlns:cx8="http://schemas.microsoft.com/office/drawing/2016/5/14/chartex" xmlns:mc="http://schemas.openxmlformats.org/markup-compatibility/2006" xmlns:aink="http://schemas.microsoft.com/office/drawing/2016/ink" xmlns:am3d="http://schemas.microsoft.com/office/drawing/2017/model3d" xmlns:o="urn:schemas-microsoft-com:office:office" xmlns:r="http://schemas.openxmlformats.org/officeDocument/2006/relationships" xmlns:m="http://schemas.openxmlformats.org/officeDocument/2006/math" xmlns:v="urn:schemas-microsoft-com:vml" xmlns:wp14="http://schemas.microsoft.com/office/word/2010/wordprocessingDrawing" xmlns:wp="http://schemas.openxmlformats.org/drawingml/2006/wordprocessingDrawing" xmlns:w10="urn:schemas-microsoft-com:office:word" xmlns:w="http://schemas.openxmlformats.org/wordprocessingml/2006/main" xmlns:w14="http://schemas.microsoft.com/office/word/2010/wordml" xmlns:w15="http://schemas.microsoft.com/office/word/2012/wordml" xmlns:w16cex="http://schemas.microsoft.com/office/word/2018/wordml/cex" xmlns:w16cid="http://schemas.microsoft.com/office/word/2016/wordml/cid" xmlns:w16="http://schemas.microsoft.com/office/word/2018/wordml" xmlns:w16se="http://schemas.microsoft.com/office/word/2015/wordml/symex" xmlns:wpg="http://schemas.microsoft.com/office/word/2010/wordprocessingGroup" xmlns:wpi="http://schemas.microsoft.com/office/word/2010/wordprocessingInk" xmlns:wne="http://schemas.microsoft.com/office/word/2006/wordml" xmlns:wps="http://schemas.microsoft.com/office/word/2010/wordprocessingShape" mc:Ignorable="w14 w15 w16se w16cid w16 w16cex wp14">
   <w:abstractNum w:abstractNumId="0" w15:restartNumberingAfterBreak="0">
+    <w:nsid w:val="0A5508EB"/>
+    <w:multiLevelType w:val="multilevel"/>
+    <w:tmpl w:val="C4162446"/>
+    <w:lvl w:ilvl="0">
+      <w:start w:val="1"/>
+      <w:numFmt w:val="bullet"/>
+      <w:lvlText w:val=""/>
+      <w:lvlJc w:val="left"/>
+      <w:pPr>
+        <w:tabs>
+          <w:tab w:val="num" w:pos="720"/>
+        </w:tabs>
+        <w:ind w:left="720" w:hanging="360"/>
+      </w:pPr>
+      <w:rPr>
+        <w:rFonts w:ascii="Symbol" w:hAnsi="Symbol" w:hint="default"/>
+        <w:sz w:val="20"/>
+      </w:rPr>
+    </w:lvl>
+    <w:lvl w:ilvl="1" w:tentative="1">
+      <w:start w:val="1"/>
+      <w:numFmt w:val="bullet"/>
+      <w:lvlText w:val="o"/>
+      <w:lvlJc w:val="left"/>
+      <w:pPr>
+        <w:tabs>
+          <w:tab w:val="num" w:pos="1440"/>
+        </w:tabs>
+        <w:ind w:left="1440" w:hanging="360"/>
+      </w:pPr>
+      <w:rPr>
+        <w:rFonts w:ascii="Courier New" w:hAnsi="Courier New" w:hint="default"/>
+        <w:sz w:val="20"/>
+      </w:rPr>
+    </w:lvl>
+    <w:lvl w:ilvl="2" w:tentative="1">
+      <w:start w:val="1"/>
+      <w:numFmt w:val="bullet"/>
+      <w:lvlText w:val=""/>
+      <w:lvlJc w:val="left"/>
+      <w:pPr>
+        <w:tabs>
+          <w:tab w:val="num" w:pos="2160"/>
+        </w:tabs>
+        <w:ind w:left="2160" w:hanging="360"/>
+      </w:pPr>
+      <w:rPr>
+        <w:rFonts w:ascii="Wingdings" w:hAnsi="Wingdings" w:hint="default"/>
+        <w:sz w:val="20"/>
+      </w:rPr>
+    </w:lvl>
+    <w:lvl w:ilvl="3" w:tentative="1">
+      <w:start w:val="1"/>
+      <w:numFmt w:val="bullet"/>
+      <w:lvlText w:val=""/>
+      <w:lvlJc w:val="left"/>
+      <w:pPr>
+        <w:tabs>
+          <w:tab w:val="num" w:pos="2880"/>
+        </w:tabs>
+        <w:ind w:left="2880" w:hanging="360"/>
+      </w:pPr>
+      <w:rPr>
+        <w:rFonts w:ascii="Wingdings" w:hAnsi="Wingdings" w:hint="default"/>
+        <w:sz w:val="20"/>
+      </w:rPr>
+    </w:lvl>
+    <w:lvl w:ilvl="4" w:tentative="1">
+      <w:start w:val="1"/>
+      <w:numFmt w:val="bullet"/>
+      <w:lvlText w:val=""/>
+      <w:lvlJc w:val="left"/>
+      <w:pPr>
+        <w:tabs>
+          <w:tab w:val="num" w:pos="3600"/>
+        </w:tabs>
+        <w:ind w:left="3600" w:hanging="360"/>
+      </w:pPr>
+      <w:rPr>
+        <w:rFonts w:ascii="Wingdings" w:hAnsi="Wingdings" w:hint="default"/>
+        <w:sz w:val="20"/>
+      </w:rPr>
+    </w:lvl>
+    <w:lvl w:ilvl="5" w:tentative="1">
+      <w:start w:val="1"/>
+      <w:numFmt w:val="bullet"/>
+      <w:lvlText w:val=""/>
+      <w:lvlJc w:val="left"/>
+      <w:pPr>
+        <w:tabs>
+          <w:tab w:val="num" w:pos="4320"/>
+        </w:tabs>
+        <w:ind w:left="4320" w:hanging="360"/>
+      </w:pPr>
+      <w:rPr>
+        <w:rFonts w:ascii="Wingdings" w:hAnsi="Wingdings" w:hint="default"/>
+        <w:sz w:val="20"/>
+      </w:rPr>
+    </w:lvl>
+    <w:lvl w:ilvl="6" w:tentative="1">
+      <w:start w:val="1"/>
+      <w:numFmt w:val="bullet"/>
+      <w:lvlText w:val=""/>
+      <w:lvlJc w:val="left"/>
+      <w:pPr>
+        <w:tabs>
+          <w:tab w:val="num" w:pos="5040"/>
+        </w:tabs>
+        <w:ind w:left="5040" w:hanging="360"/>
+      </w:pPr>
+      <w:rPr>
+        <w:rFonts w:ascii="Wingdings" w:hAnsi="Wingdings" w:hint="default"/>
+        <w:sz w:val="20"/>
+      </w:rPr>
+    </w:lvl>
+    <w:lvl w:ilvl="7" w:tentative="1">
+      <w:start w:val="1"/>
+      <w:numFmt w:val="bullet"/>
+      <w:lvlText w:val=""/>
+      <w:lvlJc w:val="left"/>
+      <w:pPr>
+        <w:tabs>
+          <w:tab w:val="num" w:pos="5760"/>
+        </w:tabs>
+        <w:ind w:left="5760" w:hanging="360"/>
+      </w:pPr>
+      <w:rPr>
+        <w:rFonts w:ascii="Wingdings" w:hAnsi="Wingdings" w:hint="default"/>
+        <w:sz w:val="20"/>
+      </w:rPr>
+    </w:lvl>
+    <w:lvl w:ilvl="8" w:tentative="1">
+      <w:start w:val="1"/>
+      <w:numFmt w:val="bullet"/>
+      <w:lvlText w:val=""/>
+      <w:lvlJc w:val="left"/>
+      <w:pPr>
+        <w:tabs>
+          <w:tab w:val="num" w:pos="6480"/>
+        </w:tabs>
+        <w:ind w:left="6480" w:hanging="360"/>
+      </w:pPr>
+      <w:rPr>
+        <w:rFonts w:ascii="Wingdings" w:hAnsi="Wingdings" w:hint="default"/>
+        <w:sz w:val="20"/>
+      </w:rPr>
+    </w:lvl>
+  </w:abstractNum>
+  <w:abstractNum w:abstractNumId="1" w15:restartNumberingAfterBreak="0">
+    <w:nsid w:val="0AB56B5D"/>
+    <w:multiLevelType w:val="multilevel"/>
+    <w:tmpl w:val="35E61486"/>
+    <w:lvl w:ilvl="0">
+      <w:start w:val="1"/>
+      <w:numFmt w:val="bullet"/>
+      <w:lvlText w:val=""/>
+      <w:lvlJc w:val="left"/>
+      <w:pPr>
+        <w:tabs>
+          <w:tab w:val="num" w:pos="720"/>
+        </w:tabs>
+        <w:ind w:left="720" w:hanging="360"/>
+      </w:pPr>
+      <w:rPr>
+        <w:rFonts w:ascii="Symbol" w:hAnsi="Symbol" w:hint="default"/>
+        <w:sz w:val="20"/>
+      </w:rPr>
+    </w:lvl>
+    <w:lvl w:ilvl="1" w:tentative="1">
+      <w:start w:val="1"/>
+      <w:numFmt w:val="bullet"/>
+      <w:lvlText w:val="o"/>
+      <w:lvlJc w:val="left"/>
+      <w:pPr>
+        <w:tabs>
+          <w:tab w:val="num" w:pos="1440"/>
+        </w:tabs>
+        <w:ind w:left="1440" w:hanging="360"/>
+      </w:pPr>
+      <w:rPr>
+        <w:rFonts w:ascii="Courier New" w:hAnsi="Courier New" w:hint="default"/>
+        <w:sz w:val="20"/>
+      </w:rPr>
+    </w:lvl>
+    <w:lvl w:ilvl="2" w:tentative="1">
+      <w:start w:val="1"/>
+      <w:numFmt w:val="bullet"/>
+      <w:lvlText w:val=""/>
+      <w:lvlJc w:val="left"/>
+      <w:pPr>
+        <w:tabs>
+          <w:tab w:val="num" w:pos="2160"/>
+        </w:tabs>
+        <w:ind w:left="2160" w:hanging="360"/>
+      </w:pPr>
+      <w:rPr>
+        <w:rFonts w:ascii="Wingdings" w:hAnsi="Wingdings" w:hint="default"/>
+        <w:sz w:val="20"/>
+      </w:rPr>
+    </w:lvl>
+    <w:lvl w:ilvl="3" w:tentative="1">
+      <w:start w:val="1"/>
+      <w:numFmt w:val="bullet"/>
+      <w:lvlText w:val=""/>
+      <w:lvlJc w:val="left"/>
+      <w:pPr>
+        <w:tabs>
+          <w:tab w:val="num" w:pos="2880"/>
+        </w:tabs>
+        <w:ind w:left="2880" w:hanging="360"/>
+      </w:pPr>
+      <w:rPr>
+        <w:rFonts w:ascii="Wingdings" w:hAnsi="Wingdings" w:hint="default"/>
+        <w:sz w:val="20"/>
+      </w:rPr>
+    </w:lvl>
+    <w:lvl w:ilvl="4" w:tentative="1">
+      <w:start w:val="1"/>
+      <w:numFmt w:val="bullet"/>
+      <w:lvlText w:val=""/>
+      <w:lvlJc w:val="left"/>
+      <w:pPr>
+        <w:tabs>
+          <w:tab w:val="num" w:pos="3600"/>
+        </w:tabs>
+        <w:ind w:left="3600" w:hanging="360"/>
+      </w:pPr>
+      <w:rPr>
+        <w:rFonts w:ascii="Wingdings" w:hAnsi="Wingdings" w:hint="default"/>
+        <w:sz w:val="20"/>
+      </w:rPr>
+    </w:lvl>
+    <w:lvl w:ilvl="5" w:tentative="1">
+      <w:start w:val="1"/>
+      <w:numFmt w:val="bullet"/>
+      <w:lvlText w:val=""/>
+      <w:lvlJc w:val="left"/>
+      <w:pPr>
+        <w:tabs>
+          <w:tab w:val="num" w:pos="4320"/>
+        </w:tabs>
+        <w:ind w:left="4320" w:hanging="360"/>
+      </w:pPr>
+      <w:rPr>
+        <w:rFonts w:ascii="Wingdings" w:hAnsi="Wingdings" w:hint="default"/>
+        <w:sz w:val="20"/>
+      </w:rPr>
+    </w:lvl>
+    <w:lvl w:ilvl="6" w:tentative="1">
+      <w:start w:val="1"/>
+      <w:numFmt w:val="bullet"/>
+      <w:lvlText w:val=""/>
+      <w:lvlJc w:val="left"/>
+      <w:pPr>
+        <w:tabs>
+          <w:tab w:val="num" w:pos="5040"/>
+        </w:tabs>
+        <w:ind w:left="5040" w:hanging="360"/>
+      </w:pPr>
+      <w:rPr>
+        <w:rFonts w:ascii="Wingdings" w:hAnsi="Wingdings" w:hint="default"/>
+        <w:sz w:val="20"/>
+      </w:rPr>
+    </w:lvl>
+    <w:lvl w:ilvl="7" w:tentative="1">
+      <w:start w:val="1"/>
+      <w:numFmt w:val="bullet"/>
+      <w:lvlText w:val=""/>
+      <w:lvlJc w:val="left"/>
+      <w:pPr>
+        <w:tabs>
+          <w:tab w:val="num" w:pos="5760"/>
+        </w:tabs>
+        <w:ind w:left="5760" w:hanging="360"/>
+      </w:pPr>
+      <w:rPr>
+        <w:rFonts w:ascii="Wingdings" w:hAnsi="Wingdings" w:hint="default"/>
+        <w:sz w:val="20"/>
+      </w:rPr>
+    </w:lvl>
+    <w:lvl w:ilvl="8" w:tentative="1">
+      <w:start w:val="1"/>
+      <w:numFmt w:val="bullet"/>
+      <w:lvlText w:val=""/>
+      <w:lvlJc w:val="left"/>
+      <w:pPr>
+        <w:tabs>
+          <w:tab w:val="num" w:pos="6480"/>
+        </w:tabs>
+        <w:ind w:left="6480" w:hanging="360"/>
+      </w:pPr>
+      <w:rPr>
+        <w:rFonts w:ascii="Wingdings" w:hAnsi="Wingdings" w:hint="default"/>
+        <w:sz w:val="20"/>
+      </w:rPr>
+    </w:lvl>
+  </w:abstractNum>
+  <w:abstractNum w:abstractNumId="2" w15:restartNumberingAfterBreak="0">
     <w:nsid w:val="0BD93146"/>
     <w:multiLevelType w:val="multilevel"/>
     <w:tmpl w:val="1996D77A"/>
@@ -1500,7 +2685,422 @@
       </w:rPr>
     </w:lvl>
   </w:abstractNum>
-  <w:abstractNum w:abstractNumId="1" w15:restartNumberingAfterBreak="0">
+  <w:abstractNum w:abstractNumId="3" w15:restartNumberingAfterBreak="0">
+    <w:nsid w:val="25892996"/>
+    <w:multiLevelType w:val="multilevel"/>
+    <w:tmpl w:val="567C635A"/>
+    <w:lvl w:ilvl="0">
+      <w:start w:val="1"/>
+      <w:numFmt w:val="bullet"/>
+      <w:lvlText w:val=""/>
+      <w:lvlJc w:val="left"/>
+      <w:pPr>
+        <w:tabs>
+          <w:tab w:val="num" w:pos="720"/>
+        </w:tabs>
+        <w:ind w:left="720" w:hanging="360"/>
+      </w:pPr>
+      <w:rPr>
+        <w:rFonts w:ascii="Symbol" w:hAnsi="Symbol" w:hint="default"/>
+        <w:sz w:val="20"/>
+      </w:rPr>
+    </w:lvl>
+    <w:lvl w:ilvl="1" w:tentative="1">
+      <w:start w:val="1"/>
+      <w:numFmt w:val="bullet"/>
+      <w:lvlText w:val="o"/>
+      <w:lvlJc w:val="left"/>
+      <w:pPr>
+        <w:tabs>
+          <w:tab w:val="num" w:pos="1440"/>
+        </w:tabs>
+        <w:ind w:left="1440" w:hanging="360"/>
+      </w:pPr>
+      <w:rPr>
+        <w:rFonts w:ascii="Courier New" w:hAnsi="Courier New" w:hint="default"/>
+        <w:sz w:val="20"/>
+      </w:rPr>
+    </w:lvl>
+    <w:lvl w:ilvl="2" w:tentative="1">
+      <w:start w:val="1"/>
+      <w:numFmt w:val="bullet"/>
+      <w:lvlText w:val=""/>
+      <w:lvlJc w:val="left"/>
+      <w:pPr>
+        <w:tabs>
+          <w:tab w:val="num" w:pos="2160"/>
+        </w:tabs>
+        <w:ind w:left="2160" w:hanging="360"/>
+      </w:pPr>
+      <w:rPr>
+        <w:rFonts w:ascii="Wingdings" w:hAnsi="Wingdings" w:hint="default"/>
+        <w:sz w:val="20"/>
+      </w:rPr>
+    </w:lvl>
+    <w:lvl w:ilvl="3" w:tentative="1">
+      <w:start w:val="1"/>
+      <w:numFmt w:val="bullet"/>
+      <w:lvlText w:val=""/>
+      <w:lvlJc w:val="left"/>
+      <w:pPr>
+        <w:tabs>
+          <w:tab w:val="num" w:pos="2880"/>
+        </w:tabs>
+        <w:ind w:left="2880" w:hanging="360"/>
+      </w:pPr>
+      <w:rPr>
+        <w:rFonts w:ascii="Wingdings" w:hAnsi="Wingdings" w:hint="default"/>
+        <w:sz w:val="20"/>
+      </w:rPr>
+    </w:lvl>
+    <w:lvl w:ilvl="4" w:tentative="1">
+      <w:start w:val="1"/>
+      <w:numFmt w:val="bullet"/>
+      <w:lvlText w:val=""/>
+      <w:lvlJc w:val="left"/>
+      <w:pPr>
+        <w:tabs>
+          <w:tab w:val="num" w:pos="3600"/>
+        </w:tabs>
+        <w:ind w:left="3600" w:hanging="360"/>
+      </w:pPr>
+      <w:rPr>
+        <w:rFonts w:ascii="Wingdings" w:hAnsi="Wingdings" w:hint="default"/>
+        <w:sz w:val="20"/>
+      </w:rPr>
+    </w:lvl>
+    <w:lvl w:ilvl="5" w:tentative="1">
+      <w:start w:val="1"/>
+      <w:numFmt w:val="bullet"/>
+      <w:lvlText w:val=""/>
+      <w:lvlJc w:val="left"/>
+      <w:pPr>
+        <w:tabs>
+          <w:tab w:val="num" w:pos="4320"/>
+        </w:tabs>
+        <w:ind w:left="4320" w:hanging="360"/>
+      </w:pPr>
+      <w:rPr>
+        <w:rFonts w:ascii="Wingdings" w:hAnsi="Wingdings" w:hint="default"/>
+        <w:sz w:val="20"/>
+      </w:rPr>
+    </w:lvl>
+    <w:lvl w:ilvl="6" w:tentative="1">
+      <w:start w:val="1"/>
+      <w:numFmt w:val="bullet"/>
+      <w:lvlText w:val=""/>
+      <w:lvlJc w:val="left"/>
+      <w:pPr>
+        <w:tabs>
+          <w:tab w:val="num" w:pos="5040"/>
+        </w:tabs>
+        <w:ind w:left="5040" w:hanging="360"/>
+      </w:pPr>
+      <w:rPr>
+        <w:rFonts w:ascii="Wingdings" w:hAnsi="Wingdings" w:hint="default"/>
+        <w:sz w:val="20"/>
+      </w:rPr>
+    </w:lvl>
+    <w:lvl w:ilvl="7" w:tentative="1">
+      <w:start w:val="1"/>
+      <w:numFmt w:val="bullet"/>
+      <w:lvlText w:val=""/>
+      <w:lvlJc w:val="left"/>
+      <w:pPr>
+        <w:tabs>
+          <w:tab w:val="num" w:pos="5760"/>
+        </w:tabs>
+        <w:ind w:left="5760" w:hanging="360"/>
+      </w:pPr>
+      <w:rPr>
+        <w:rFonts w:ascii="Wingdings" w:hAnsi="Wingdings" w:hint="default"/>
+        <w:sz w:val="20"/>
+      </w:rPr>
+    </w:lvl>
+    <w:lvl w:ilvl="8" w:tentative="1">
+      <w:start w:val="1"/>
+      <w:numFmt w:val="bullet"/>
+      <w:lvlText w:val=""/>
+      <w:lvlJc w:val="left"/>
+      <w:pPr>
+        <w:tabs>
+          <w:tab w:val="num" w:pos="6480"/>
+        </w:tabs>
+        <w:ind w:left="6480" w:hanging="360"/>
+      </w:pPr>
+      <w:rPr>
+        <w:rFonts w:ascii="Wingdings" w:hAnsi="Wingdings" w:hint="default"/>
+        <w:sz w:val="20"/>
+      </w:rPr>
+    </w:lvl>
+  </w:abstractNum>
+  <w:abstractNum w:abstractNumId="4" w15:restartNumberingAfterBreak="0">
+    <w:nsid w:val="290A15FF"/>
+    <w:multiLevelType w:val="multilevel"/>
+    <w:tmpl w:val="18BE7FD4"/>
+    <w:lvl w:ilvl="0">
+      <w:start w:val="1"/>
+      <w:numFmt w:val="decimal"/>
+      <w:lvlText w:val="%1."/>
+      <w:lvlJc w:val="left"/>
+      <w:pPr>
+        <w:tabs>
+          <w:tab w:val="num" w:pos="720"/>
+        </w:tabs>
+        <w:ind w:left="720" w:hanging="360"/>
+      </w:pPr>
+    </w:lvl>
+    <w:lvl w:ilvl="1">
+      <w:start w:val="1"/>
+      <w:numFmt w:val="bullet"/>
+      <w:lvlText w:val="o"/>
+      <w:lvlJc w:val="left"/>
+      <w:pPr>
+        <w:tabs>
+          <w:tab w:val="num" w:pos="1440"/>
+        </w:tabs>
+        <w:ind w:left="1440" w:hanging="360"/>
+      </w:pPr>
+      <w:rPr>
+        <w:rFonts w:ascii="Courier New" w:hAnsi="Courier New" w:hint="default"/>
+        <w:sz w:val="20"/>
+      </w:rPr>
+    </w:lvl>
+    <w:lvl w:ilvl="2" w:tentative="1">
+      <w:start w:val="1"/>
+      <w:numFmt w:val="decimal"/>
+      <w:lvlText w:val="%3."/>
+      <w:lvlJc w:val="left"/>
+      <w:pPr>
+        <w:tabs>
+          <w:tab w:val="num" w:pos="2160"/>
+        </w:tabs>
+        <w:ind w:left="2160" w:hanging="360"/>
+      </w:pPr>
+    </w:lvl>
+    <w:lvl w:ilvl="3" w:tentative="1">
+      <w:start w:val="1"/>
+      <w:numFmt w:val="decimal"/>
+      <w:lvlText w:val="%4."/>
+      <w:lvlJc w:val="left"/>
+      <w:pPr>
+        <w:tabs>
+          <w:tab w:val="num" w:pos="2880"/>
+        </w:tabs>
+        <w:ind w:left="2880" w:hanging="360"/>
+      </w:pPr>
+    </w:lvl>
+    <w:lvl w:ilvl="4" w:tentative="1">
+      <w:start w:val="1"/>
+      <w:numFmt w:val="decimal"/>
+      <w:lvlText w:val="%5."/>
+      <w:lvlJc w:val="left"/>
+      <w:pPr>
+        <w:tabs>
+          <w:tab w:val="num" w:pos="3600"/>
+        </w:tabs>
+        <w:ind w:left="3600" w:hanging="360"/>
+      </w:pPr>
+    </w:lvl>
+    <w:lvl w:ilvl="5" w:tentative="1">
+      <w:start w:val="1"/>
+      <w:numFmt w:val="decimal"/>
+      <w:lvlText w:val="%6."/>
+      <w:lvlJc w:val="left"/>
+      <w:pPr>
+        <w:tabs>
+          <w:tab w:val="num" w:pos="4320"/>
+        </w:tabs>
+        <w:ind w:left="4320" w:hanging="360"/>
+      </w:pPr>
+    </w:lvl>
+    <w:lvl w:ilvl="6" w:tentative="1">
+      <w:start w:val="1"/>
+      <w:numFmt w:val="decimal"/>
+      <w:lvlText w:val="%7."/>
+      <w:lvlJc w:val="left"/>
+      <w:pPr>
+        <w:tabs>
+          <w:tab w:val="num" w:pos="5040"/>
+        </w:tabs>
+        <w:ind w:left="5040" w:hanging="360"/>
+      </w:pPr>
+    </w:lvl>
+    <w:lvl w:ilvl="7" w:tentative="1">
+      <w:start w:val="1"/>
+      <w:numFmt w:val="decimal"/>
+      <w:lvlText w:val="%8."/>
+      <w:lvlJc w:val="left"/>
+      <w:pPr>
+        <w:tabs>
+          <w:tab w:val="num" w:pos="5760"/>
+        </w:tabs>
+        <w:ind w:left="5760" w:hanging="360"/>
+      </w:pPr>
+    </w:lvl>
+    <w:lvl w:ilvl="8" w:tentative="1">
+      <w:start w:val="1"/>
+      <w:numFmt w:val="decimal"/>
+      <w:lvlText w:val="%9."/>
+      <w:lvlJc w:val="left"/>
+      <w:pPr>
+        <w:tabs>
+          <w:tab w:val="num" w:pos="6480"/>
+        </w:tabs>
+        <w:ind w:left="6480" w:hanging="360"/>
+      </w:pPr>
+    </w:lvl>
+  </w:abstractNum>
+  <w:abstractNum w:abstractNumId="5" w15:restartNumberingAfterBreak="0">
+    <w:nsid w:val="29671D89"/>
+    <w:multiLevelType w:val="multilevel"/>
+    <w:tmpl w:val="8828F1AE"/>
+    <w:lvl w:ilvl="0">
+      <w:start w:val="1"/>
+      <w:numFmt w:val="bullet"/>
+      <w:lvlText w:val=""/>
+      <w:lvlJc w:val="left"/>
+      <w:pPr>
+        <w:tabs>
+          <w:tab w:val="num" w:pos="720"/>
+        </w:tabs>
+        <w:ind w:left="720" w:hanging="360"/>
+      </w:pPr>
+      <w:rPr>
+        <w:rFonts w:ascii="Symbol" w:hAnsi="Symbol" w:hint="default"/>
+        <w:sz w:val="20"/>
+      </w:rPr>
+    </w:lvl>
+    <w:lvl w:ilvl="1" w:tentative="1">
+      <w:start w:val="1"/>
+      <w:numFmt w:val="bullet"/>
+      <w:lvlText w:val="o"/>
+      <w:lvlJc w:val="left"/>
+      <w:pPr>
+        <w:tabs>
+          <w:tab w:val="num" w:pos="1440"/>
+        </w:tabs>
+        <w:ind w:left="1440" w:hanging="360"/>
+      </w:pPr>
+      <w:rPr>
+        <w:rFonts w:ascii="Courier New" w:hAnsi="Courier New" w:hint="default"/>
+        <w:sz w:val="20"/>
+      </w:rPr>
+    </w:lvl>
+    <w:lvl w:ilvl="2" w:tentative="1">
+      <w:start w:val="1"/>
+      <w:numFmt w:val="bullet"/>
+      <w:lvlText w:val=""/>
+      <w:lvlJc w:val="left"/>
+      <w:pPr>
+        <w:tabs>
+          <w:tab w:val="num" w:pos="2160"/>
+        </w:tabs>
+        <w:ind w:left="2160" w:hanging="360"/>
+      </w:pPr>
+      <w:rPr>
+        <w:rFonts w:ascii="Wingdings" w:hAnsi="Wingdings" w:hint="default"/>
+        <w:sz w:val="20"/>
+      </w:rPr>
+    </w:lvl>
+    <w:lvl w:ilvl="3" w:tentative="1">
+      <w:start w:val="1"/>
+      <w:numFmt w:val="bullet"/>
+      <w:lvlText w:val=""/>
+      <w:lvlJc w:val="left"/>
+      <w:pPr>
+        <w:tabs>
+          <w:tab w:val="num" w:pos="2880"/>
+        </w:tabs>
+        <w:ind w:left="2880" w:hanging="360"/>
+      </w:pPr>
+      <w:rPr>
+        <w:rFonts w:ascii="Wingdings" w:hAnsi="Wingdings" w:hint="default"/>
+        <w:sz w:val="20"/>
+      </w:rPr>
+    </w:lvl>
+    <w:lvl w:ilvl="4" w:tentative="1">
+      <w:start w:val="1"/>
+      <w:numFmt w:val="bullet"/>
+      <w:lvlText w:val=""/>
+      <w:lvlJc w:val="left"/>
+      <w:pPr>
+        <w:tabs>
+          <w:tab w:val="num" w:pos="3600"/>
+        </w:tabs>
+        <w:ind w:left="3600" w:hanging="360"/>
+      </w:pPr>
+      <w:rPr>
+        <w:rFonts w:ascii="Wingdings" w:hAnsi="Wingdings" w:hint="default"/>
+        <w:sz w:val="20"/>
+      </w:rPr>
+    </w:lvl>
+    <w:lvl w:ilvl="5" w:tentative="1">
+      <w:start w:val="1"/>
+      <w:numFmt w:val="bullet"/>
+      <w:lvlText w:val=""/>
+      <w:lvlJc w:val="left"/>
+      <w:pPr>
+        <w:tabs>
+          <w:tab w:val="num" w:pos="4320"/>
+        </w:tabs>
+        <w:ind w:left="4320" w:hanging="360"/>
+      </w:pPr>
+      <w:rPr>
+        <w:rFonts w:ascii="Wingdings" w:hAnsi="Wingdings" w:hint="default"/>
+        <w:sz w:val="20"/>
+      </w:rPr>
+    </w:lvl>
+    <w:lvl w:ilvl="6" w:tentative="1">
+      <w:start w:val="1"/>
+      <w:numFmt w:val="bullet"/>
+      <w:lvlText w:val=""/>
+      <w:lvlJc w:val="left"/>
+      <w:pPr>
+        <w:tabs>
+          <w:tab w:val="num" w:pos="5040"/>
+        </w:tabs>
+        <w:ind w:left="5040" w:hanging="360"/>
+      </w:pPr>
+      <w:rPr>
+        <w:rFonts w:ascii="Wingdings" w:hAnsi="Wingdings" w:hint="default"/>
+        <w:sz w:val="20"/>
+      </w:rPr>
+    </w:lvl>
+    <w:lvl w:ilvl="7" w:tentative="1">
+      <w:start w:val="1"/>
+      <w:numFmt w:val="bullet"/>
+      <w:lvlText w:val=""/>
+      <w:lvlJc w:val="left"/>
+      <w:pPr>
+        <w:tabs>
+          <w:tab w:val="num" w:pos="5760"/>
+        </w:tabs>
+        <w:ind w:left="5760" w:hanging="360"/>
+      </w:pPr>
+      <w:rPr>
+        <w:rFonts w:ascii="Wingdings" w:hAnsi="Wingdings" w:hint="default"/>
+        <w:sz w:val="20"/>
+      </w:rPr>
+    </w:lvl>
+    <w:lvl w:ilvl="8" w:tentative="1">
+      <w:start w:val="1"/>
+      <w:numFmt w:val="bullet"/>
+      <w:lvlText w:val=""/>
+      <w:lvlJc w:val="left"/>
+      <w:pPr>
+        <w:tabs>
+          <w:tab w:val="num" w:pos="6480"/>
+        </w:tabs>
+        <w:ind w:left="6480" w:hanging="360"/>
+      </w:pPr>
+      <w:rPr>
+        <w:rFonts w:ascii="Wingdings" w:hAnsi="Wingdings" w:hint="default"/>
+        <w:sz w:val="20"/>
+      </w:rPr>
+    </w:lvl>
+  </w:abstractNum>
+  <w:abstractNum w:abstractNumId="6" w15:restartNumberingAfterBreak="0">
     <w:nsid w:val="2FD95EE6"/>
     <w:multiLevelType w:val="multilevel"/>
     <w:tmpl w:val="CE94865E"/>
@@ -1721,7 +3321,603 @@
       </w:rPr>
     </w:lvl>
   </w:abstractNum>
-  <w:abstractNum w:abstractNumId="2" w15:restartNumberingAfterBreak="0">
+  <w:abstractNum w:abstractNumId="7" w15:restartNumberingAfterBreak="0">
+    <w:nsid w:val="305735BE"/>
+    <w:multiLevelType w:val="multilevel"/>
+    <w:tmpl w:val="CC603E1A"/>
+    <w:lvl w:ilvl="0">
+      <w:start w:val="1"/>
+      <w:numFmt w:val="bullet"/>
+      <w:lvlText w:val=""/>
+      <w:lvlJc w:val="left"/>
+      <w:pPr>
+        <w:tabs>
+          <w:tab w:val="num" w:pos="720"/>
+        </w:tabs>
+        <w:ind w:left="720" w:hanging="360"/>
+      </w:pPr>
+      <w:rPr>
+        <w:rFonts w:ascii="Symbol" w:hAnsi="Symbol" w:hint="default"/>
+        <w:sz w:val="20"/>
+      </w:rPr>
+    </w:lvl>
+    <w:lvl w:ilvl="1" w:tentative="1">
+      <w:start w:val="1"/>
+      <w:numFmt w:val="bullet"/>
+      <w:lvlText w:val="o"/>
+      <w:lvlJc w:val="left"/>
+      <w:pPr>
+        <w:tabs>
+          <w:tab w:val="num" w:pos="1440"/>
+        </w:tabs>
+        <w:ind w:left="1440" w:hanging="360"/>
+      </w:pPr>
+      <w:rPr>
+        <w:rFonts w:ascii="Courier New" w:hAnsi="Courier New" w:hint="default"/>
+        <w:sz w:val="20"/>
+      </w:rPr>
+    </w:lvl>
+    <w:lvl w:ilvl="2" w:tentative="1">
+      <w:start w:val="1"/>
+      <w:numFmt w:val="bullet"/>
+      <w:lvlText w:val=""/>
+      <w:lvlJc w:val="left"/>
+      <w:pPr>
+        <w:tabs>
+          <w:tab w:val="num" w:pos="2160"/>
+        </w:tabs>
+        <w:ind w:left="2160" w:hanging="360"/>
+      </w:pPr>
+      <w:rPr>
+        <w:rFonts w:ascii="Wingdings" w:hAnsi="Wingdings" w:hint="default"/>
+        <w:sz w:val="20"/>
+      </w:rPr>
+    </w:lvl>
+    <w:lvl w:ilvl="3" w:tentative="1">
+      <w:start w:val="1"/>
+      <w:numFmt w:val="bullet"/>
+      <w:lvlText w:val=""/>
+      <w:lvlJc w:val="left"/>
+      <w:pPr>
+        <w:tabs>
+          <w:tab w:val="num" w:pos="2880"/>
+        </w:tabs>
+        <w:ind w:left="2880" w:hanging="360"/>
+      </w:pPr>
+      <w:rPr>
+        <w:rFonts w:ascii="Wingdings" w:hAnsi="Wingdings" w:hint="default"/>
+        <w:sz w:val="20"/>
+      </w:rPr>
+    </w:lvl>
+    <w:lvl w:ilvl="4" w:tentative="1">
+      <w:start w:val="1"/>
+      <w:numFmt w:val="bullet"/>
+      <w:lvlText w:val=""/>
+      <w:lvlJc w:val="left"/>
+      <w:pPr>
+        <w:tabs>
+          <w:tab w:val="num" w:pos="3600"/>
+        </w:tabs>
+        <w:ind w:left="3600" w:hanging="360"/>
+      </w:pPr>
+      <w:rPr>
+        <w:rFonts w:ascii="Wingdings" w:hAnsi="Wingdings" w:hint="default"/>
+        <w:sz w:val="20"/>
+      </w:rPr>
+    </w:lvl>
+    <w:lvl w:ilvl="5" w:tentative="1">
+      <w:start w:val="1"/>
+      <w:numFmt w:val="bullet"/>
+      <w:lvlText w:val=""/>
+      <w:lvlJc w:val="left"/>
+      <w:pPr>
+        <w:tabs>
+          <w:tab w:val="num" w:pos="4320"/>
+        </w:tabs>
+        <w:ind w:left="4320" w:hanging="360"/>
+      </w:pPr>
+      <w:rPr>
+        <w:rFonts w:ascii="Wingdings" w:hAnsi="Wingdings" w:hint="default"/>
+        <w:sz w:val="20"/>
+      </w:rPr>
+    </w:lvl>
+    <w:lvl w:ilvl="6" w:tentative="1">
+      <w:start w:val="1"/>
+      <w:numFmt w:val="bullet"/>
+      <w:lvlText w:val=""/>
+      <w:lvlJc w:val="left"/>
+      <w:pPr>
+        <w:tabs>
+          <w:tab w:val="num" w:pos="5040"/>
+        </w:tabs>
+        <w:ind w:left="5040" w:hanging="360"/>
+      </w:pPr>
+      <w:rPr>
+        <w:rFonts w:ascii="Wingdings" w:hAnsi="Wingdings" w:hint="default"/>
+        <w:sz w:val="20"/>
+      </w:rPr>
+    </w:lvl>
+    <w:lvl w:ilvl="7" w:tentative="1">
+      <w:start w:val="1"/>
+      <w:numFmt w:val="bullet"/>
+      <w:lvlText w:val=""/>
+      <w:lvlJc w:val="left"/>
+      <w:pPr>
+        <w:tabs>
+          <w:tab w:val="num" w:pos="5760"/>
+        </w:tabs>
+        <w:ind w:left="5760" w:hanging="360"/>
+      </w:pPr>
+      <w:rPr>
+        <w:rFonts w:ascii="Wingdings" w:hAnsi="Wingdings" w:hint="default"/>
+        <w:sz w:val="20"/>
+      </w:rPr>
+    </w:lvl>
+    <w:lvl w:ilvl="8" w:tentative="1">
+      <w:start w:val="1"/>
+      <w:numFmt w:val="bullet"/>
+      <w:lvlText w:val=""/>
+      <w:lvlJc w:val="left"/>
+      <w:pPr>
+        <w:tabs>
+          <w:tab w:val="num" w:pos="6480"/>
+        </w:tabs>
+        <w:ind w:left="6480" w:hanging="360"/>
+      </w:pPr>
+      <w:rPr>
+        <w:rFonts w:ascii="Wingdings" w:hAnsi="Wingdings" w:hint="default"/>
+        <w:sz w:val="20"/>
+      </w:rPr>
+    </w:lvl>
+  </w:abstractNum>
+  <w:abstractNum w:abstractNumId="8" w15:restartNumberingAfterBreak="0">
+    <w:nsid w:val="307B0CB4"/>
+    <w:multiLevelType w:val="multilevel"/>
+    <w:tmpl w:val="FCE21716"/>
+    <w:lvl w:ilvl="0">
+      <w:start w:val="1"/>
+      <w:numFmt w:val="bullet"/>
+      <w:lvlText w:val=""/>
+      <w:lvlJc w:val="left"/>
+      <w:pPr>
+        <w:tabs>
+          <w:tab w:val="num" w:pos="720"/>
+        </w:tabs>
+        <w:ind w:left="720" w:hanging="360"/>
+      </w:pPr>
+      <w:rPr>
+        <w:rFonts w:ascii="Symbol" w:hAnsi="Symbol" w:hint="default"/>
+        <w:sz w:val="20"/>
+      </w:rPr>
+    </w:lvl>
+    <w:lvl w:ilvl="1" w:tentative="1">
+      <w:start w:val="1"/>
+      <w:numFmt w:val="bullet"/>
+      <w:lvlText w:val="o"/>
+      <w:lvlJc w:val="left"/>
+      <w:pPr>
+        <w:tabs>
+          <w:tab w:val="num" w:pos="1440"/>
+        </w:tabs>
+        <w:ind w:left="1440" w:hanging="360"/>
+      </w:pPr>
+      <w:rPr>
+        <w:rFonts w:ascii="Courier New" w:hAnsi="Courier New" w:hint="default"/>
+        <w:sz w:val="20"/>
+      </w:rPr>
+    </w:lvl>
+    <w:lvl w:ilvl="2" w:tentative="1">
+      <w:start w:val="1"/>
+      <w:numFmt w:val="bullet"/>
+      <w:lvlText w:val=""/>
+      <w:lvlJc w:val="left"/>
+      <w:pPr>
+        <w:tabs>
+          <w:tab w:val="num" w:pos="2160"/>
+        </w:tabs>
+        <w:ind w:left="2160" w:hanging="360"/>
+      </w:pPr>
+      <w:rPr>
+        <w:rFonts w:ascii="Wingdings" w:hAnsi="Wingdings" w:hint="default"/>
+        <w:sz w:val="20"/>
+      </w:rPr>
+    </w:lvl>
+    <w:lvl w:ilvl="3" w:tentative="1">
+      <w:start w:val="1"/>
+      <w:numFmt w:val="bullet"/>
+      <w:lvlText w:val=""/>
+      <w:lvlJc w:val="left"/>
+      <w:pPr>
+        <w:tabs>
+          <w:tab w:val="num" w:pos="2880"/>
+        </w:tabs>
+        <w:ind w:left="2880" w:hanging="360"/>
+      </w:pPr>
+      <w:rPr>
+        <w:rFonts w:ascii="Wingdings" w:hAnsi="Wingdings" w:hint="default"/>
+        <w:sz w:val="20"/>
+      </w:rPr>
+    </w:lvl>
+    <w:lvl w:ilvl="4" w:tentative="1">
+      <w:start w:val="1"/>
+      <w:numFmt w:val="bullet"/>
+      <w:lvlText w:val=""/>
+      <w:lvlJc w:val="left"/>
+      <w:pPr>
+        <w:tabs>
+          <w:tab w:val="num" w:pos="3600"/>
+        </w:tabs>
+        <w:ind w:left="3600" w:hanging="360"/>
+      </w:pPr>
+      <w:rPr>
+        <w:rFonts w:ascii="Wingdings" w:hAnsi="Wingdings" w:hint="default"/>
+        <w:sz w:val="20"/>
+      </w:rPr>
+    </w:lvl>
+    <w:lvl w:ilvl="5" w:tentative="1">
+      <w:start w:val="1"/>
+      <w:numFmt w:val="bullet"/>
+      <w:lvlText w:val=""/>
+      <w:lvlJc w:val="left"/>
+      <w:pPr>
+        <w:tabs>
+          <w:tab w:val="num" w:pos="4320"/>
+        </w:tabs>
+        <w:ind w:left="4320" w:hanging="360"/>
+      </w:pPr>
+      <w:rPr>
+        <w:rFonts w:ascii="Wingdings" w:hAnsi="Wingdings" w:hint="default"/>
+        <w:sz w:val="20"/>
+      </w:rPr>
+    </w:lvl>
+    <w:lvl w:ilvl="6" w:tentative="1">
+      <w:start w:val="1"/>
+      <w:numFmt w:val="bullet"/>
+      <w:lvlText w:val=""/>
+      <w:lvlJc w:val="left"/>
+      <w:pPr>
+        <w:tabs>
+          <w:tab w:val="num" w:pos="5040"/>
+        </w:tabs>
+        <w:ind w:left="5040" w:hanging="360"/>
+      </w:pPr>
+      <w:rPr>
+        <w:rFonts w:ascii="Wingdings" w:hAnsi="Wingdings" w:hint="default"/>
+        <w:sz w:val="20"/>
+      </w:rPr>
+    </w:lvl>
+    <w:lvl w:ilvl="7" w:tentative="1">
+      <w:start w:val="1"/>
+      <w:numFmt w:val="bullet"/>
+      <w:lvlText w:val=""/>
+      <w:lvlJc w:val="left"/>
+      <w:pPr>
+        <w:tabs>
+          <w:tab w:val="num" w:pos="5760"/>
+        </w:tabs>
+        <w:ind w:left="5760" w:hanging="360"/>
+      </w:pPr>
+      <w:rPr>
+        <w:rFonts w:ascii="Wingdings" w:hAnsi="Wingdings" w:hint="default"/>
+        <w:sz w:val="20"/>
+      </w:rPr>
+    </w:lvl>
+    <w:lvl w:ilvl="8" w:tentative="1">
+      <w:start w:val="1"/>
+      <w:numFmt w:val="bullet"/>
+      <w:lvlText w:val=""/>
+      <w:lvlJc w:val="left"/>
+      <w:pPr>
+        <w:tabs>
+          <w:tab w:val="num" w:pos="6480"/>
+        </w:tabs>
+        <w:ind w:left="6480" w:hanging="360"/>
+      </w:pPr>
+      <w:rPr>
+        <w:rFonts w:ascii="Wingdings" w:hAnsi="Wingdings" w:hint="default"/>
+        <w:sz w:val="20"/>
+      </w:rPr>
+    </w:lvl>
+  </w:abstractNum>
+  <w:abstractNum w:abstractNumId="9" w15:restartNumberingAfterBreak="0">
+    <w:nsid w:val="326474E3"/>
+    <w:multiLevelType w:val="multilevel"/>
+    <w:tmpl w:val="FBA6C33A"/>
+    <w:lvl w:ilvl="0">
+      <w:start w:val="1"/>
+      <w:numFmt w:val="bullet"/>
+      <w:lvlText w:val=""/>
+      <w:lvlJc w:val="left"/>
+      <w:pPr>
+        <w:tabs>
+          <w:tab w:val="num" w:pos="720"/>
+        </w:tabs>
+        <w:ind w:left="720" w:hanging="360"/>
+      </w:pPr>
+      <w:rPr>
+        <w:rFonts w:ascii="Symbol" w:hAnsi="Symbol" w:hint="default"/>
+        <w:sz w:val="20"/>
+      </w:rPr>
+    </w:lvl>
+    <w:lvl w:ilvl="1" w:tentative="1">
+      <w:start w:val="1"/>
+      <w:numFmt w:val="bullet"/>
+      <w:lvlText w:val="o"/>
+      <w:lvlJc w:val="left"/>
+      <w:pPr>
+        <w:tabs>
+          <w:tab w:val="num" w:pos="1440"/>
+        </w:tabs>
+        <w:ind w:left="1440" w:hanging="360"/>
+      </w:pPr>
+      <w:rPr>
+        <w:rFonts w:ascii="Courier New" w:hAnsi="Courier New" w:hint="default"/>
+        <w:sz w:val="20"/>
+      </w:rPr>
+    </w:lvl>
+    <w:lvl w:ilvl="2" w:tentative="1">
+      <w:start w:val="1"/>
+      <w:numFmt w:val="bullet"/>
+      <w:lvlText w:val=""/>
+      <w:lvlJc w:val="left"/>
+      <w:pPr>
+        <w:tabs>
+          <w:tab w:val="num" w:pos="2160"/>
+        </w:tabs>
+        <w:ind w:left="2160" w:hanging="360"/>
+      </w:pPr>
+      <w:rPr>
+        <w:rFonts w:ascii="Wingdings" w:hAnsi="Wingdings" w:hint="default"/>
+        <w:sz w:val="20"/>
+      </w:rPr>
+    </w:lvl>
+    <w:lvl w:ilvl="3" w:tentative="1">
+      <w:start w:val="1"/>
+      <w:numFmt w:val="bullet"/>
+      <w:lvlText w:val=""/>
+      <w:lvlJc w:val="left"/>
+      <w:pPr>
+        <w:tabs>
+          <w:tab w:val="num" w:pos="2880"/>
+        </w:tabs>
+        <w:ind w:left="2880" w:hanging="360"/>
+      </w:pPr>
+      <w:rPr>
+        <w:rFonts w:ascii="Wingdings" w:hAnsi="Wingdings" w:hint="default"/>
+        <w:sz w:val="20"/>
+      </w:rPr>
+    </w:lvl>
+    <w:lvl w:ilvl="4" w:tentative="1">
+      <w:start w:val="1"/>
+      <w:numFmt w:val="bullet"/>
+      <w:lvlText w:val=""/>
+      <w:lvlJc w:val="left"/>
+      <w:pPr>
+        <w:tabs>
+          <w:tab w:val="num" w:pos="3600"/>
+        </w:tabs>
+        <w:ind w:left="3600" w:hanging="360"/>
+      </w:pPr>
+      <w:rPr>
+        <w:rFonts w:ascii="Wingdings" w:hAnsi="Wingdings" w:hint="default"/>
+        <w:sz w:val="20"/>
+      </w:rPr>
+    </w:lvl>
+    <w:lvl w:ilvl="5" w:tentative="1">
+      <w:start w:val="1"/>
+      <w:numFmt w:val="bullet"/>
+      <w:lvlText w:val=""/>
+      <w:lvlJc w:val="left"/>
+      <w:pPr>
+        <w:tabs>
+          <w:tab w:val="num" w:pos="4320"/>
+        </w:tabs>
+        <w:ind w:left="4320" w:hanging="360"/>
+      </w:pPr>
+      <w:rPr>
+        <w:rFonts w:ascii="Wingdings" w:hAnsi="Wingdings" w:hint="default"/>
+        <w:sz w:val="20"/>
+      </w:rPr>
+    </w:lvl>
+    <w:lvl w:ilvl="6" w:tentative="1">
+      <w:start w:val="1"/>
+      <w:numFmt w:val="bullet"/>
+      <w:lvlText w:val=""/>
+      <w:lvlJc w:val="left"/>
+      <w:pPr>
+        <w:tabs>
+          <w:tab w:val="num" w:pos="5040"/>
+        </w:tabs>
+        <w:ind w:left="5040" w:hanging="360"/>
+      </w:pPr>
+      <w:rPr>
+        <w:rFonts w:ascii="Wingdings" w:hAnsi="Wingdings" w:hint="default"/>
+        <w:sz w:val="20"/>
+      </w:rPr>
+    </w:lvl>
+    <w:lvl w:ilvl="7" w:tentative="1">
+      <w:start w:val="1"/>
+      <w:numFmt w:val="bullet"/>
+      <w:lvlText w:val=""/>
+      <w:lvlJc w:val="left"/>
+      <w:pPr>
+        <w:tabs>
+          <w:tab w:val="num" w:pos="5760"/>
+        </w:tabs>
+        <w:ind w:left="5760" w:hanging="360"/>
+      </w:pPr>
+      <w:rPr>
+        <w:rFonts w:ascii="Wingdings" w:hAnsi="Wingdings" w:hint="default"/>
+        <w:sz w:val="20"/>
+      </w:rPr>
+    </w:lvl>
+    <w:lvl w:ilvl="8" w:tentative="1">
+      <w:start w:val="1"/>
+      <w:numFmt w:val="bullet"/>
+      <w:lvlText w:val=""/>
+      <w:lvlJc w:val="left"/>
+      <w:pPr>
+        <w:tabs>
+          <w:tab w:val="num" w:pos="6480"/>
+        </w:tabs>
+        <w:ind w:left="6480" w:hanging="360"/>
+      </w:pPr>
+      <w:rPr>
+        <w:rFonts w:ascii="Wingdings" w:hAnsi="Wingdings" w:hint="default"/>
+        <w:sz w:val="20"/>
+      </w:rPr>
+    </w:lvl>
+  </w:abstractNum>
+  <w:abstractNum w:abstractNumId="10" w15:restartNumberingAfterBreak="0">
+    <w:nsid w:val="3B5031DC"/>
+    <w:multiLevelType w:val="multilevel"/>
+    <w:tmpl w:val="F1025820"/>
+    <w:lvl w:ilvl="0">
+      <w:start w:val="1"/>
+      <w:numFmt w:val="bullet"/>
+      <w:lvlText w:val=""/>
+      <w:lvlJc w:val="left"/>
+      <w:pPr>
+        <w:tabs>
+          <w:tab w:val="num" w:pos="720"/>
+        </w:tabs>
+        <w:ind w:left="720" w:hanging="360"/>
+      </w:pPr>
+      <w:rPr>
+        <w:rFonts w:ascii="Symbol" w:hAnsi="Symbol" w:hint="default"/>
+        <w:sz w:val="20"/>
+      </w:rPr>
+    </w:lvl>
+    <w:lvl w:ilvl="1" w:tentative="1">
+      <w:start w:val="1"/>
+      <w:numFmt w:val="bullet"/>
+      <w:lvlText w:val="o"/>
+      <w:lvlJc w:val="left"/>
+      <w:pPr>
+        <w:tabs>
+          <w:tab w:val="num" w:pos="1440"/>
+        </w:tabs>
+        <w:ind w:left="1440" w:hanging="360"/>
+      </w:pPr>
+      <w:rPr>
+        <w:rFonts w:ascii="Courier New" w:hAnsi="Courier New" w:hint="default"/>
+        <w:sz w:val="20"/>
+      </w:rPr>
+    </w:lvl>
+    <w:lvl w:ilvl="2" w:tentative="1">
+      <w:start w:val="1"/>
+      <w:numFmt w:val="bullet"/>
+      <w:lvlText w:val=""/>
+      <w:lvlJc w:val="left"/>
+      <w:pPr>
+        <w:tabs>
+          <w:tab w:val="num" w:pos="2160"/>
+        </w:tabs>
+        <w:ind w:left="2160" w:hanging="360"/>
+      </w:pPr>
+      <w:rPr>
+        <w:rFonts w:ascii="Wingdings" w:hAnsi="Wingdings" w:hint="default"/>
+        <w:sz w:val="20"/>
+      </w:rPr>
+    </w:lvl>
+    <w:lvl w:ilvl="3" w:tentative="1">
+      <w:start w:val="1"/>
+      <w:numFmt w:val="bullet"/>
+      <w:lvlText w:val=""/>
+      <w:lvlJc w:val="left"/>
+      <w:pPr>
+        <w:tabs>
+          <w:tab w:val="num" w:pos="2880"/>
+        </w:tabs>
+        <w:ind w:left="2880" w:hanging="360"/>
+      </w:pPr>
+      <w:rPr>
+        <w:rFonts w:ascii="Wingdings" w:hAnsi="Wingdings" w:hint="default"/>
+        <w:sz w:val="20"/>
+      </w:rPr>
+    </w:lvl>
+    <w:lvl w:ilvl="4" w:tentative="1">
+      <w:start w:val="1"/>
+      <w:numFmt w:val="bullet"/>
+      <w:lvlText w:val=""/>
+      <w:lvlJc w:val="left"/>
+      <w:pPr>
+        <w:tabs>
+          <w:tab w:val="num" w:pos="3600"/>
+        </w:tabs>
+        <w:ind w:left="3600" w:hanging="360"/>
+      </w:pPr>
+      <w:rPr>
+        <w:rFonts w:ascii="Wingdings" w:hAnsi="Wingdings" w:hint="default"/>
+        <w:sz w:val="20"/>
+      </w:rPr>
+    </w:lvl>
+    <w:lvl w:ilvl="5" w:tentative="1">
+      <w:start w:val="1"/>
+      <w:numFmt w:val="bullet"/>
+      <w:lvlText w:val=""/>
+      <w:lvlJc w:val="left"/>
+      <w:pPr>
+        <w:tabs>
+          <w:tab w:val="num" w:pos="4320"/>
+        </w:tabs>
+        <w:ind w:left="4320" w:hanging="360"/>
+      </w:pPr>
+      <w:rPr>
+        <w:rFonts w:ascii="Wingdings" w:hAnsi="Wingdings" w:hint="default"/>
+        <w:sz w:val="20"/>
+      </w:rPr>
+    </w:lvl>
+    <w:lvl w:ilvl="6" w:tentative="1">
+      <w:start w:val="1"/>
+      <w:numFmt w:val="bullet"/>
+      <w:lvlText w:val=""/>
+      <w:lvlJc w:val="left"/>
+      <w:pPr>
+        <w:tabs>
+          <w:tab w:val="num" w:pos="5040"/>
+        </w:tabs>
+        <w:ind w:left="5040" w:hanging="360"/>
+      </w:pPr>
+      <w:rPr>
+        <w:rFonts w:ascii="Wingdings" w:hAnsi="Wingdings" w:hint="default"/>
+        <w:sz w:val="20"/>
+      </w:rPr>
+    </w:lvl>
+    <w:lvl w:ilvl="7" w:tentative="1">
+      <w:start w:val="1"/>
+      <w:numFmt w:val="bullet"/>
+      <w:lvlText w:val=""/>
+      <w:lvlJc w:val="left"/>
+      <w:pPr>
+        <w:tabs>
+          <w:tab w:val="num" w:pos="5760"/>
+        </w:tabs>
+        <w:ind w:left="5760" w:hanging="360"/>
+      </w:pPr>
+      <w:rPr>
+        <w:rFonts w:ascii="Wingdings" w:hAnsi="Wingdings" w:hint="default"/>
+        <w:sz w:val="20"/>
+      </w:rPr>
+    </w:lvl>
+    <w:lvl w:ilvl="8" w:tentative="1">
+      <w:start w:val="1"/>
+      <w:numFmt w:val="bullet"/>
+      <w:lvlText w:val=""/>
+      <w:lvlJc w:val="left"/>
+      <w:pPr>
+        <w:tabs>
+          <w:tab w:val="num" w:pos="6480"/>
+        </w:tabs>
+        <w:ind w:left="6480" w:hanging="360"/>
+      </w:pPr>
+      <w:rPr>
+        <w:rFonts w:ascii="Wingdings" w:hAnsi="Wingdings" w:hint="default"/>
+        <w:sz w:val="20"/>
+      </w:rPr>
+    </w:lvl>
+  </w:abstractNum>
+  <w:abstractNum w:abstractNumId="11" w15:restartNumberingAfterBreak="0">
     <w:nsid w:val="40780BCA"/>
     <w:multiLevelType w:val="multilevel"/>
     <w:tmpl w:val="C61CB8BE"/>
@@ -1944,7 +4140,7 @@
       </w:rPr>
     </w:lvl>
   </w:abstractNum>
-  <w:abstractNum w:abstractNumId="3" w15:restartNumberingAfterBreak="0">
+  <w:abstractNum w:abstractNumId="12" w15:restartNumberingAfterBreak="0">
     <w:nsid w:val="475A0CA0"/>
     <w:multiLevelType w:val="multilevel"/>
     <w:tmpl w:val="0FE64298"/>
@@ -2057,7 +4253,7 @@
       </w:pPr>
     </w:lvl>
   </w:abstractNum>
-  <w:abstractNum w:abstractNumId="4" w15:restartNumberingAfterBreak="0">
+  <w:abstractNum w:abstractNumId="13" w15:restartNumberingAfterBreak="0">
     <w:nsid w:val="4CFB05C9"/>
     <w:multiLevelType w:val="multilevel"/>
     <w:tmpl w:val="43EE7766"/>
@@ -2206,7 +4402,156 @@
       </w:rPr>
     </w:lvl>
   </w:abstractNum>
-  <w:abstractNum w:abstractNumId="5" w15:restartNumberingAfterBreak="0">
+  <w:abstractNum w:abstractNumId="14" w15:restartNumberingAfterBreak="0">
+    <w:nsid w:val="4FEC54CD"/>
+    <w:multiLevelType w:val="multilevel"/>
+    <w:tmpl w:val="1CCADCAA"/>
+    <w:lvl w:ilvl="0">
+      <w:start w:val="1"/>
+      <w:numFmt w:val="bullet"/>
+      <w:lvlText w:val=""/>
+      <w:lvlJc w:val="left"/>
+      <w:pPr>
+        <w:tabs>
+          <w:tab w:val="num" w:pos="720"/>
+        </w:tabs>
+        <w:ind w:left="720" w:hanging="360"/>
+      </w:pPr>
+      <w:rPr>
+        <w:rFonts w:ascii="Symbol" w:hAnsi="Symbol" w:hint="default"/>
+        <w:sz w:val="20"/>
+      </w:rPr>
+    </w:lvl>
+    <w:lvl w:ilvl="1" w:tentative="1">
+      <w:start w:val="1"/>
+      <w:numFmt w:val="bullet"/>
+      <w:lvlText w:val="o"/>
+      <w:lvlJc w:val="left"/>
+      <w:pPr>
+        <w:tabs>
+          <w:tab w:val="num" w:pos="1440"/>
+        </w:tabs>
+        <w:ind w:left="1440" w:hanging="360"/>
+      </w:pPr>
+      <w:rPr>
+        <w:rFonts w:ascii="Courier New" w:hAnsi="Courier New" w:hint="default"/>
+        <w:sz w:val="20"/>
+      </w:rPr>
+    </w:lvl>
+    <w:lvl w:ilvl="2" w:tentative="1">
+      <w:start w:val="1"/>
+      <w:numFmt w:val="bullet"/>
+      <w:lvlText w:val=""/>
+      <w:lvlJc w:val="left"/>
+      <w:pPr>
+        <w:tabs>
+          <w:tab w:val="num" w:pos="2160"/>
+        </w:tabs>
+        <w:ind w:left="2160" w:hanging="360"/>
+      </w:pPr>
+      <w:rPr>
+        <w:rFonts w:ascii="Wingdings" w:hAnsi="Wingdings" w:hint="default"/>
+        <w:sz w:val="20"/>
+      </w:rPr>
+    </w:lvl>
+    <w:lvl w:ilvl="3" w:tentative="1">
+      <w:start w:val="1"/>
+      <w:numFmt w:val="bullet"/>
+      <w:lvlText w:val=""/>
+      <w:lvlJc w:val="left"/>
+      <w:pPr>
+        <w:tabs>
+          <w:tab w:val="num" w:pos="2880"/>
+        </w:tabs>
+        <w:ind w:left="2880" w:hanging="360"/>
+      </w:pPr>
+      <w:rPr>
+        <w:rFonts w:ascii="Wingdings" w:hAnsi="Wingdings" w:hint="default"/>
+        <w:sz w:val="20"/>
+      </w:rPr>
+    </w:lvl>
+    <w:lvl w:ilvl="4" w:tentative="1">
+      <w:start w:val="1"/>
+      <w:numFmt w:val="bullet"/>
+      <w:lvlText w:val=""/>
+      <w:lvlJc w:val="left"/>
+      <w:pPr>
+        <w:tabs>
+          <w:tab w:val="num" w:pos="3600"/>
+        </w:tabs>
+        <w:ind w:left="3600" w:hanging="360"/>
+      </w:pPr>
+      <w:rPr>
+        <w:rFonts w:ascii="Wingdings" w:hAnsi="Wingdings" w:hint="default"/>
+        <w:sz w:val="20"/>
+      </w:rPr>
+    </w:lvl>
+    <w:lvl w:ilvl="5" w:tentative="1">
+      <w:start w:val="1"/>
+      <w:numFmt w:val="bullet"/>
+      <w:lvlText w:val=""/>
+      <w:lvlJc w:val="left"/>
+      <w:pPr>
+        <w:tabs>
+          <w:tab w:val="num" w:pos="4320"/>
+        </w:tabs>
+        <w:ind w:left="4320" w:hanging="360"/>
+      </w:pPr>
+      <w:rPr>
+        <w:rFonts w:ascii="Wingdings" w:hAnsi="Wingdings" w:hint="default"/>
+        <w:sz w:val="20"/>
+      </w:rPr>
+    </w:lvl>
+    <w:lvl w:ilvl="6" w:tentative="1">
+      <w:start w:val="1"/>
+      <w:numFmt w:val="bullet"/>
+      <w:lvlText w:val=""/>
+      <w:lvlJc w:val="left"/>
+      <w:pPr>
+        <w:tabs>
+          <w:tab w:val="num" w:pos="5040"/>
+        </w:tabs>
+        <w:ind w:left="5040" w:hanging="360"/>
+      </w:pPr>
+      <w:rPr>
+        <w:rFonts w:ascii="Wingdings" w:hAnsi="Wingdings" w:hint="default"/>
+        <w:sz w:val="20"/>
+      </w:rPr>
+    </w:lvl>
+    <w:lvl w:ilvl="7" w:tentative="1">
+      <w:start w:val="1"/>
+      <w:numFmt w:val="bullet"/>
+      <w:lvlText w:val=""/>
+      <w:lvlJc w:val="left"/>
+      <w:pPr>
+        <w:tabs>
+          <w:tab w:val="num" w:pos="5760"/>
+        </w:tabs>
+        <w:ind w:left="5760" w:hanging="360"/>
+      </w:pPr>
+      <w:rPr>
+        <w:rFonts w:ascii="Wingdings" w:hAnsi="Wingdings" w:hint="default"/>
+        <w:sz w:val="20"/>
+      </w:rPr>
+    </w:lvl>
+    <w:lvl w:ilvl="8" w:tentative="1">
+      <w:start w:val="1"/>
+      <w:numFmt w:val="bullet"/>
+      <w:lvlText w:val=""/>
+      <w:lvlJc w:val="left"/>
+      <w:pPr>
+        <w:tabs>
+          <w:tab w:val="num" w:pos="6480"/>
+        </w:tabs>
+        <w:ind w:left="6480" w:hanging="360"/>
+      </w:pPr>
+      <w:rPr>
+        <w:rFonts w:ascii="Wingdings" w:hAnsi="Wingdings" w:hint="default"/>
+        <w:sz w:val="20"/>
+      </w:rPr>
+    </w:lvl>
+  </w:abstractNum>
+  <w:abstractNum w:abstractNumId="15" w15:restartNumberingAfterBreak="0">
     <w:nsid w:val="5DBF25CB"/>
     <w:multiLevelType w:val="multilevel"/>
     <w:tmpl w:val="51B27834"/>
@@ -2355,7 +4700,7 @@
       </w:rPr>
     </w:lvl>
   </w:abstractNum>
-  <w:abstractNum w:abstractNumId="6" w15:restartNumberingAfterBreak="0">
+  <w:abstractNum w:abstractNumId="16" w15:restartNumberingAfterBreak="0">
     <w:nsid w:val="68566F44"/>
     <w:multiLevelType w:val="multilevel"/>
     <w:tmpl w:val="B450D866"/>
@@ -2468,7 +4813,7 @@
       </w:pPr>
     </w:lvl>
   </w:abstractNum>
-  <w:abstractNum w:abstractNumId="7" w15:restartNumberingAfterBreak="0">
+  <w:abstractNum w:abstractNumId="17" w15:restartNumberingAfterBreak="0">
     <w:nsid w:val="75534976"/>
     <w:multiLevelType w:val="multilevel"/>
     <w:tmpl w:val="08BA2F8A"/>
@@ -2617,7 +4962,7 @@
       </w:rPr>
     </w:lvl>
   </w:abstractNum>
-  <w:abstractNum w:abstractNumId="8" w15:restartNumberingAfterBreak="0">
+  <w:abstractNum w:abstractNumId="18" w15:restartNumberingAfterBreak="0">
     <w:nsid w:val="78EC531A"/>
     <w:multiLevelType w:val="multilevel"/>
     <w:tmpl w:val="9134DFF2"/>
@@ -2730,7 +5075,7 @@
       </w:pPr>
     </w:lvl>
   </w:abstractNum>
-  <w:abstractNum w:abstractNumId="9" w15:restartNumberingAfterBreak="0">
+  <w:abstractNum w:abstractNumId="19" w15:restartNumberingAfterBreak="0">
     <w:nsid w:val="7CA10893"/>
     <w:multiLevelType w:val="multilevel"/>
     <w:tmpl w:val="42BE07F2"/>
@@ -2880,34 +5225,64 @@
     </w:lvl>
   </w:abstractNum>
   <w:num w:numId="1">
+    <w:abstractNumId w:val="11"/>
+  </w:num>
+  <w:num w:numId="2">
+    <w:abstractNumId w:val="17"/>
+  </w:num>
+  <w:num w:numId="3">
     <w:abstractNumId w:val="2"/>
   </w:num>
-  <w:num w:numId="2">
+  <w:num w:numId="4">
+    <w:abstractNumId w:val="13"/>
+  </w:num>
+  <w:num w:numId="5">
+    <w:abstractNumId w:val="6"/>
+  </w:num>
+  <w:num w:numId="6">
+    <w:abstractNumId w:val="16"/>
+  </w:num>
+  <w:num w:numId="7">
+    <w:abstractNumId w:val="12"/>
+  </w:num>
+  <w:num w:numId="8">
+    <w:abstractNumId w:val="15"/>
+  </w:num>
+  <w:num w:numId="9">
+    <w:abstractNumId w:val="19"/>
+  </w:num>
+  <w:num w:numId="10">
+    <w:abstractNumId w:val="18"/>
+  </w:num>
+  <w:num w:numId="11">
+    <w:abstractNumId w:val="10"/>
+  </w:num>
+  <w:num w:numId="12">
+    <w:abstractNumId w:val="1"/>
+  </w:num>
+  <w:num w:numId="13">
+    <w:abstractNumId w:val="8"/>
+  </w:num>
+  <w:num w:numId="14">
+    <w:abstractNumId w:val="9"/>
+  </w:num>
+  <w:num w:numId="15">
     <w:abstractNumId w:val="7"/>
   </w:num>
-  <w:num w:numId="3">
+  <w:num w:numId="16">
+    <w:abstractNumId w:val="3"/>
+  </w:num>
+  <w:num w:numId="17">
     <w:abstractNumId w:val="0"/>
   </w:num>
-  <w:num w:numId="4">
-    <w:abstractNumId w:val="4"/>
+  <w:num w:numId="18">
+    <w:abstractNumId w:val="14"/>
   </w:num>
-  <w:num w:numId="5">
-    <w:abstractNumId w:val="1"/>
-  </w:num>
-  <w:num w:numId="6">
-    <w:abstractNumId w:val="6"/>
-  </w:num>
-  <w:num w:numId="7">
-    <w:abstractNumId w:val="3"/>
-  </w:num>
-  <w:num w:numId="8">
+  <w:num w:numId="19">
     <w:abstractNumId w:val="5"/>
   </w:num>
-  <w:num w:numId="9">
-    <w:abstractNumId w:val="9"/>
-  </w:num>
-  <w:num w:numId="10">
-    <w:abstractNumId w:val="8"/>
+  <w:num w:numId="20">
+    <w:abstractNumId w:val="4"/>
   </w:num>
   <w:numIdMacAtCleanup w:val="3"/>
 </w:numbering>
@@ -4142,7 +6517,7 @@
 </file>
 
 <file path=customXml/itemProps1.xml><?xml version="1.0" encoding="utf-8"?>
-<ds:datastoreItem xmlns:ds="http://schemas.openxmlformats.org/officeDocument/2006/customXml" ds:itemID="{0C0FA81F-F285-4391-97CF-FC67084C9359}">
+<ds:datastoreItem xmlns:ds="http://schemas.openxmlformats.org/officeDocument/2006/customXml" ds:itemID="{F1AD4EBD-4729-46CE-ACBE-194F0E5CABDB}">
   <ds:schemaRefs>
     <ds:schemaRef ds:uri="http://schemas.openxmlformats.org/officeDocument/2006/bibliography"/>
   </ds:schemaRefs>

</xml_diff>